<commit_message>
Existing application analysis - started BGG
</commit_message>
<xml_diff>
--- a/Design/MeepleWood_General Design.docx
+++ b/Design/MeepleWood_General Design.docx
@@ -783,7 +783,7 @@
                 <w:noProof/>
                 <w:webHidden/>
               </w:rPr>
-              <w:t>4</w:t>
+              <w:t>3</w:t>
             </w:r>
             <w:r>
               <w:rPr>
@@ -856,7 +856,7 @@
                 <w:noProof/>
                 <w:webHidden/>
               </w:rPr>
-              <w:t>5</w:t>
+              <w:t>4</w:t>
             </w:r>
             <w:r>
               <w:rPr>
@@ -929,7 +929,7 @@
                 <w:noProof/>
                 <w:webHidden/>
               </w:rPr>
-              <w:t>5</w:t>
+              <w:t>4</w:t>
             </w:r>
             <w:r>
               <w:rPr>
@@ -1002,7 +1002,7 @@
                 <w:noProof/>
                 <w:webHidden/>
               </w:rPr>
-              <w:t>6</w:t>
+              <w:t>5</w:t>
             </w:r>
             <w:r>
               <w:rPr>
@@ -1075,7 +1075,7 @@
                 <w:noProof/>
                 <w:webHidden/>
               </w:rPr>
-              <w:t>7</w:t>
+              <w:t>6</w:t>
             </w:r>
             <w:r>
               <w:rPr>
@@ -1862,6 +1862,9 @@
       <w:bookmarkEnd w:id="5"/>
     </w:p>
     <w:p>
+      <w:pPr>
+        <w:spacing w:after="0"/>
+      </w:pPr>
       <w:r>
         <w:t>Nested Design Model provides the analytical foundation through three nested levels:</w:t>
       </w:r>
@@ -1930,6 +1933,9 @@
       </w:r>
     </w:p>
     <w:p>
+      <w:pPr>
+        <w:spacing w:after="0"/>
+      </w:pPr>
       <w:r>
         <w:t>Design Thinking drives the creative process:</w:t>
       </w:r>
@@ -1971,6 +1977,9 @@
       </w:r>
     </w:p>
     <w:p>
+      <w:pPr>
+        <w:spacing w:after="0"/>
+      </w:pPr>
       <w:r>
         <w:t>Agile Development</w:t>
       </w:r>
@@ -1990,7 +1999,7 @@
         </w:numPr>
       </w:pPr>
       <w:r>
-        <w:t>User Stories and iterative development for flexible feature delivery</w:t>
+        <w:t>User Stories and iterative development</w:t>
       </w:r>
     </w:p>
     <w:p>
@@ -2007,24 +2016,10 @@
     </w:p>
     <w:p>
       <w:pPr>
-        <w:rPr>
-          <w:rFonts w:asciiTheme="majorHAnsi" w:eastAsiaTheme="majorEastAsia" w:hAnsiTheme="majorHAnsi" w:cstheme="majorBidi"/>
-          <w:color w:val="2F5496" w:themeColor="accent1" w:themeShade="BF"/>
-          <w:sz w:val="40"/>
-          <w:szCs w:val="40"/>
-        </w:rPr>
-      </w:pPr>
-      <w:r>
-        <w:br w:type="page"/>
-      </w:r>
-    </w:p>
-    <w:p>
-      <w:pPr>
         <w:pStyle w:val="Kop1"/>
       </w:pPr>
       <w:bookmarkStart w:id="6" w:name="_Toc226315628"/>
       <w:r>
-        <w:lastRenderedPageBreak/>
         <w:t>Domain Situation</w:t>
       </w:r>
       <w:bookmarkEnd w:id="6"/>
@@ -2138,19 +2133,6 @@
     </w:p>
     <w:p>
       <w:pPr>
-        <w:rPr>
-          <w:rFonts w:asciiTheme="majorHAnsi" w:eastAsiaTheme="majorEastAsia" w:hAnsiTheme="majorHAnsi" w:cstheme="majorBidi"/>
-          <w:color w:val="2F5496" w:themeColor="accent1" w:themeShade="BF"/>
-          <w:sz w:val="40"/>
-          <w:szCs w:val="40"/>
-        </w:rPr>
-      </w:pPr>
-      <w:r>
-        <w:br w:type="page"/>
-      </w:r>
-    </w:p>
-    <w:p>
-      <w:pPr>
         <w:pStyle w:val="Kop1"/>
       </w:pPr>
       <w:bookmarkStart w:id="7" w:name="_Toc226315629"/>
@@ -2659,13 +2641,7 @@
         </w:sdtContent>
       </w:sdt>
       <w:r>
-        <w:t xml:space="preserve">. Since its launch in January 2000, BoardGameGeek has grown into the central hub for board game information, offering a large user-generated database containing reviews, ratings, images, videos, forums, and play statistics for more than 150,000 </w:t>
-      </w:r>
-      <w:r>
-        <w:t>board</w:t>
-      </w:r>
-      <w:r>
-        <w:t xml:space="preserve"> games. The platform has over 4 million accounts reported in 2025 and hundreds of thousands of active users contributing ratings and play data. This extensive database and active community have made BoardGameGeek the primary reference source for both hobbyists and researchers in the board game domain.</w:t>
+        <w:t>. Since its launch in January 2000, BoardGameGeek has grown into the central hub for board game information, offering a large user-generated database containing reviews, ratings, images, videos, forums, and play statistics for more than 150,000 board games. The platform has over 4 million accounts reported in 2025 and hundreds of thousands of active users contributing ratings and play data. This extensive database and active community have made BoardGameGeek the primary reference source for both hobbyists and researchers in the board game domain.</w:t>
       </w:r>
     </w:p>
     <w:p>
@@ -2694,17 +2670,908 @@
       </w:pPr>
       <w:proofErr w:type="spellStart"/>
       <w:r>
+        <w:lastRenderedPageBreak/>
         <w:t>Boardgamegeek</w:t>
       </w:r>
       <w:proofErr w:type="spellEnd"/>
     </w:p>
     <w:p>
+      <w:pPr>
+        <w:keepNext/>
+        <w:spacing w:after="0"/>
+      </w:pPr>
+      <w:r>
+        <w:rPr>
+          <w:noProof/>
+        </w:rPr>
+        <w:drawing>
+          <wp:inline distT="0" distB="0" distL="0" distR="0" wp14:anchorId="6480A332" wp14:editId="3CA277C9">
+            <wp:extent cx="5731510" cy="2733040"/>
+            <wp:effectExtent l="0" t="0" r="2540" b="0"/>
+            <wp:docPr id="142832902" name="Afbeelding 1"/>
+            <wp:cNvGraphicFramePr>
+              <a:graphicFrameLocks xmlns:a="http://schemas.openxmlformats.org/drawingml/2006/main" noChangeAspect="1"/>
+            </wp:cNvGraphicFramePr>
+            <a:graphic xmlns:a="http://schemas.openxmlformats.org/drawingml/2006/main">
+              <a:graphicData uri="http://schemas.openxmlformats.org/drawingml/2006/picture">
+                <pic:pic xmlns:pic="http://schemas.openxmlformats.org/drawingml/2006/picture">
+                  <pic:nvPicPr>
+                    <pic:cNvPr id="142832902" name=""/>
+                    <pic:cNvPicPr/>
+                  </pic:nvPicPr>
+                  <pic:blipFill>
+                    <a:blip r:embed="rId15"/>
+                    <a:stretch>
+                      <a:fillRect/>
+                    </a:stretch>
+                  </pic:blipFill>
+                  <pic:spPr>
+                    <a:xfrm>
+                      <a:off x="0" y="0"/>
+                      <a:ext cx="5731510" cy="2733040"/>
+                    </a:xfrm>
+                    <a:prstGeom prst="rect">
+                      <a:avLst/>
+                    </a:prstGeom>
+                  </pic:spPr>
+                </pic:pic>
+              </a:graphicData>
+            </a:graphic>
+          </wp:inline>
+        </w:drawing>
+      </w:r>
+    </w:p>
+    <w:p>
+      <w:pPr>
+        <w:pStyle w:val="Bijschrift"/>
+        <w:jc w:val="right"/>
+      </w:pPr>
+      <w:r>
+        <w:t xml:space="preserve">Figure </w:t>
+      </w:r>
+      <w:r>
+        <w:fldChar w:fldCharType="begin"/>
+      </w:r>
+      <w:r>
+        <w:instrText xml:space="preserve"> SEQ Figure \* ARABIC </w:instrText>
+      </w:r>
+      <w:r>
+        <w:fldChar w:fldCharType="separate"/>
+      </w:r>
+      <w:r>
+        <w:rPr>
+          <w:noProof/>
+        </w:rPr>
+        <w:t>1</w:t>
+      </w:r>
+      <w:r>
+        <w:fldChar w:fldCharType="end"/>
+      </w:r>
+      <w:r>
+        <w:t xml:space="preserve">: </w:t>
+      </w:r>
       <w:proofErr w:type="spellStart"/>
       <w:r>
-        <w:t>Sdf</w:t>
+        <w:t>Homescreen</w:t>
       </w:r>
       <w:proofErr w:type="spellEnd"/>
+      <w:r>
+        <w:t xml:space="preserve"> BGG</w:t>
+      </w:r>
     </w:p>
+    <w:p>
+      <w:r>
+        <w:t xml:space="preserve">BoardGameGeek </w:t>
+      </w:r>
+      <w:r>
+        <w:t xml:space="preserve">has a extensively documented and detailed descriptions of all </w:t>
+      </w:r>
+      <w:r>
+        <w:t xml:space="preserve">features </w:t>
+      </w:r>
+      <w:r>
+        <w:t>o</w:t>
+      </w:r>
+      <w:r>
+        <w:t>n their website</w:t>
+      </w:r>
+      <w:r>
+        <w:t xml:space="preserve"> </w:t>
+      </w:r>
+      <w:sdt>
+        <w:sdtPr>
+          <w:id w:val="-350483778"/>
+          <w:citation/>
+        </w:sdtPr>
+        <w:sdtContent>
+          <w:r>
+            <w:fldChar w:fldCharType="begin"/>
+          </w:r>
+          <w:r>
+            <w:instrText xml:space="preserve">CITATION BGG \y  \l 2057 </w:instrText>
+          </w:r>
+          <w:r>
+            <w:fldChar w:fldCharType="separate"/>
+          </w:r>
+          <w:r>
+            <w:rPr>
+              <w:noProof/>
+            </w:rPr>
+            <w:t>(BGG Wiki)</w:t>
+          </w:r>
+          <w:r>
+            <w:fldChar w:fldCharType="end"/>
+          </w:r>
+        </w:sdtContent>
+      </w:sdt>
+      <w:r>
+        <w:t xml:space="preserve">. The main focus for Meeplewood is collection management and tracking play sessions and will be </w:t>
+      </w:r>
+      <w:r>
+        <w:t xml:space="preserve">analysed </w:t>
+      </w:r>
+      <w:r>
+        <w:t>in detail.</w:t>
+      </w:r>
+    </w:p>
+    <w:p>
+      <w:pPr>
+        <w:pStyle w:val="Kop3"/>
+      </w:pPr>
+      <w:r>
+        <w:t>Collection Management</w:t>
+      </w:r>
+    </w:p>
+    <w:p>
+      <w:r>
+        <w:drawing>
+          <wp:anchor distT="0" distB="0" distL="114300" distR="114300" simplePos="0" relativeHeight="251662336" behindDoc="0" locked="0" layoutInCell="1" allowOverlap="1" wp14:anchorId="16B67194" wp14:editId="42519CBF">
+            <wp:simplePos x="0" y="0"/>
+            <wp:positionH relativeFrom="column">
+              <wp:posOffset>4183380</wp:posOffset>
+            </wp:positionH>
+            <wp:positionV relativeFrom="paragraph">
+              <wp:posOffset>4445</wp:posOffset>
+            </wp:positionV>
+            <wp:extent cx="1539240" cy="1283970"/>
+            <wp:effectExtent l="0" t="0" r="3810" b="0"/>
+            <wp:wrapSquare wrapText="bothSides"/>
+            <wp:docPr id="254558862" name="Afbeelding 1"/>
+            <wp:cNvGraphicFramePr>
+              <a:graphicFrameLocks xmlns:a="http://schemas.openxmlformats.org/drawingml/2006/main" noChangeAspect="1"/>
+            </wp:cNvGraphicFramePr>
+            <a:graphic xmlns:a="http://schemas.openxmlformats.org/drawingml/2006/main">
+              <a:graphicData uri="http://schemas.openxmlformats.org/drawingml/2006/picture">
+                <pic:pic xmlns:pic="http://schemas.openxmlformats.org/drawingml/2006/picture">
+                  <pic:nvPicPr>
+                    <pic:cNvPr id="254558862" name=""/>
+                    <pic:cNvPicPr/>
+                  </pic:nvPicPr>
+                  <pic:blipFill>
+                    <a:blip r:embed="rId16" cstate="print">
+                      <a:extLst>
+                        <a:ext uri="{28A0092B-C50C-407E-A947-70E740481C1C}">
+                          <a14:useLocalDpi xmlns:a14="http://schemas.microsoft.com/office/drawing/2010/main" val="0"/>
+                        </a:ext>
+                      </a:extLst>
+                    </a:blip>
+                    <a:stretch>
+                      <a:fillRect/>
+                    </a:stretch>
+                  </pic:blipFill>
+                  <pic:spPr>
+                    <a:xfrm>
+                      <a:off x="0" y="0"/>
+                      <a:ext cx="1539240" cy="1283970"/>
+                    </a:xfrm>
+                    <a:prstGeom prst="rect">
+                      <a:avLst/>
+                    </a:prstGeom>
+                  </pic:spPr>
+                </pic:pic>
+              </a:graphicData>
+            </a:graphic>
+            <wp14:sizeRelH relativeFrom="margin">
+              <wp14:pctWidth>0</wp14:pctWidth>
+            </wp14:sizeRelH>
+            <wp14:sizeRelV relativeFrom="margin">
+              <wp14:pctHeight>0</wp14:pctHeight>
+            </wp14:sizeRelV>
+          </wp:anchor>
+        </w:drawing>
+      </w:r>
+      <w:r>
+        <w:t>In the upper-right corner</w:t>
+      </w:r>
+      <w:r>
+        <w:t xml:space="preserve"> on the BoardGameGeek website</w:t>
+      </w:r>
+      <w:r>
+        <w:t>, an icon displaying the user’s chosen avatar provides access to several quick options.</w:t>
+      </w:r>
+      <w:r>
+        <w:t xml:space="preserve"> </w:t>
+      </w:r>
+      <w:r>
+        <w:t xml:space="preserve">Selecting </w:t>
+      </w:r>
+      <w:r>
+        <w:t>this icon opens a small menu with shortcuts to profile-related actions</w:t>
+      </w:r>
+      <w:r>
+        <w:t xml:space="preserve"> </w:t>
+      </w:r>
+      <w:r>
+        <w:t>(</w:t>
+      </w:r>
+      <w:r>
+        <w:fldChar w:fldCharType="begin"/>
+      </w:r>
+      <w:r>
+        <w:instrText xml:space="preserve"> REF _Ref226406582 \h </w:instrText>
+      </w:r>
+      <w:r>
+        <w:instrText xml:space="preserve"> \* MERGEFORMAT </w:instrText>
+      </w:r>
+      <w:r>
+        <w:fldChar w:fldCharType="separate"/>
+      </w:r>
+      <w:r>
+        <w:t>Figure 2</w:t>
+      </w:r>
+      <w:r>
+        <w:fldChar w:fldCharType="end"/>
+      </w:r>
+      <w:r>
+        <w:t xml:space="preserve">). </w:t>
+      </w:r>
+    </w:p>
+    <w:p>
+      <w:r>
+        <w:rPr>
+          <w:noProof/>
+        </w:rPr>
+        <mc:AlternateContent>
+          <mc:Choice Requires="wps">
+            <w:drawing>
+              <wp:anchor distT="0" distB="0" distL="114300" distR="114300" simplePos="0" relativeHeight="251664384" behindDoc="0" locked="0" layoutInCell="1" allowOverlap="1" wp14:anchorId="3F1BD93D" wp14:editId="49A058E2">
+                <wp:simplePos x="0" y="0"/>
+                <wp:positionH relativeFrom="column">
+                  <wp:posOffset>4203065</wp:posOffset>
+                </wp:positionH>
+                <wp:positionV relativeFrom="paragraph">
+                  <wp:posOffset>478790</wp:posOffset>
+                </wp:positionV>
+                <wp:extent cx="1494790" cy="161925"/>
+                <wp:effectExtent l="0" t="0" r="0" b="9525"/>
+                <wp:wrapSquare wrapText="bothSides"/>
+                <wp:docPr id="635516806" name="Tekstvak 1"/>
+                <wp:cNvGraphicFramePr/>
+                <a:graphic xmlns:a="http://schemas.openxmlformats.org/drawingml/2006/main">
+                  <a:graphicData uri="http://schemas.microsoft.com/office/word/2010/wordprocessingShape">
+                    <wps:wsp>
+                      <wps:cNvSpPr txBox="1"/>
+                      <wps:spPr>
+                        <a:xfrm>
+                          <a:off x="0" y="0"/>
+                          <a:ext cx="1494790" cy="161925"/>
+                        </a:xfrm>
+                        <a:prstGeom prst="rect">
+                          <a:avLst/>
+                        </a:prstGeom>
+                        <a:solidFill>
+                          <a:prstClr val="white"/>
+                        </a:solidFill>
+                        <a:ln>
+                          <a:noFill/>
+                        </a:ln>
+                      </wps:spPr>
+                      <wps:txbx>
+                        <w:txbxContent>
+                          <w:p>
+                            <w:pPr>
+                              <w:pStyle w:val="Bijschrift"/>
+                              <w:jc w:val="right"/>
+                              <w:rPr>
+                                <w:sz w:val="20"/>
+                                <w:szCs w:val="20"/>
+                              </w:rPr>
+                            </w:pPr>
+                            <w:bookmarkStart w:id="10" w:name="_Ref226406582"/>
+                            <w:r>
+                              <w:rPr>
+                                <w:sz w:val="16"/>
+                                <w:szCs w:val="16"/>
+                              </w:rPr>
+                              <w:t xml:space="preserve">Figure </w:t>
+                            </w:r>
+                            <w:r>
+                              <w:rPr>
+                                <w:sz w:val="16"/>
+                                <w:szCs w:val="16"/>
+                              </w:rPr>
+                              <w:fldChar w:fldCharType="begin"/>
+                            </w:r>
+                            <w:r>
+                              <w:rPr>
+                                <w:sz w:val="16"/>
+                                <w:szCs w:val="16"/>
+                              </w:rPr>
+                              <w:instrText xml:space="preserve"> SEQ Figure \* ARABIC </w:instrText>
+                            </w:r>
+                            <w:r>
+                              <w:rPr>
+                                <w:sz w:val="16"/>
+                                <w:szCs w:val="16"/>
+                              </w:rPr>
+                              <w:fldChar w:fldCharType="separate"/>
+                            </w:r>
+                            <w:r>
+                              <w:rPr>
+                                <w:noProof/>
+                                <w:sz w:val="16"/>
+                                <w:szCs w:val="16"/>
+                              </w:rPr>
+                              <w:t>2</w:t>
+                            </w:r>
+                            <w:r>
+                              <w:rPr>
+                                <w:sz w:val="16"/>
+                                <w:szCs w:val="16"/>
+                              </w:rPr>
+                              <w:fldChar w:fldCharType="end"/>
+                            </w:r>
+                            <w:bookmarkEnd w:id="10"/>
+                            <w:r>
+                              <w:rPr>
+                                <w:sz w:val="16"/>
+                                <w:szCs w:val="16"/>
+                              </w:rPr>
+                              <w:t>: Profile options</w:t>
+                            </w:r>
+                          </w:p>
+                        </w:txbxContent>
+                      </wps:txbx>
+                      <wps:bodyPr rot="0" spcFirstLastPara="0" vertOverflow="overflow" horzOverflow="overflow" vert="horz" wrap="square" lIns="0" tIns="0" rIns="0" bIns="0" numCol="1" spcCol="0" rtlCol="0" fromWordArt="0" anchor="t" anchorCtr="0" forceAA="0" compatLnSpc="1">
+                        <a:prstTxWarp prst="textNoShape">
+                          <a:avLst/>
+                        </a:prstTxWarp>
+                        <a:noAutofit/>
+                      </wps:bodyPr>
+                    </wps:wsp>
+                  </a:graphicData>
+                </a:graphic>
+                <wp14:sizeRelH relativeFrom="margin">
+                  <wp14:pctWidth>0</wp14:pctWidth>
+                </wp14:sizeRelH>
+                <wp14:sizeRelV relativeFrom="margin">
+                  <wp14:pctHeight>0</wp14:pctHeight>
+                </wp14:sizeRelV>
+              </wp:anchor>
+            </w:drawing>
+          </mc:Choice>
+          <mc:Fallback>
+            <w:pict>
+              <v:shape w14:anchorId="3F1BD93D" id="Tekstvak 1" o:spid="_x0000_s1027" type="#_x0000_t202" style="position:absolute;margin-left:330.95pt;margin-top:37.7pt;width:117.7pt;height:12.75pt;z-index:251664384;visibility:visible;mso-wrap-style:square;mso-width-percent:0;mso-height-percent:0;mso-wrap-distance-left:9pt;mso-wrap-distance-top:0;mso-wrap-distance-right:9pt;mso-wrap-distance-bottom:0;mso-position-horizontal:absolute;mso-position-horizontal-relative:text;mso-position-vertical:absolute;mso-position-vertical-relative:text;mso-width-percent:0;mso-height-percent:0;mso-width-relative:margin;mso-height-relative:margin;v-text-anchor:top" o:gfxdata="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" stroked="f">
+                <v:textbox inset="0,0,0,0">
+                  <w:txbxContent>
+                    <w:p>
+                      <w:pPr>
+                        <w:pStyle w:val="Bijschrift"/>
+                        <w:jc w:val="right"/>
+                        <w:rPr>
+                          <w:sz w:val="20"/>
+                          <w:szCs w:val="20"/>
+                        </w:rPr>
+                      </w:pPr>
+                      <w:bookmarkStart w:id="11" w:name="_Ref226406582"/>
+                      <w:r>
+                        <w:rPr>
+                          <w:sz w:val="16"/>
+                          <w:szCs w:val="16"/>
+                        </w:rPr>
+                        <w:t xml:space="preserve">Figure </w:t>
+                      </w:r>
+                      <w:r>
+                        <w:rPr>
+                          <w:sz w:val="16"/>
+                          <w:szCs w:val="16"/>
+                        </w:rPr>
+                        <w:fldChar w:fldCharType="begin"/>
+                      </w:r>
+                      <w:r>
+                        <w:rPr>
+                          <w:sz w:val="16"/>
+                          <w:szCs w:val="16"/>
+                        </w:rPr>
+                        <w:instrText xml:space="preserve"> SEQ Figure \* ARABIC </w:instrText>
+                      </w:r>
+                      <w:r>
+                        <w:rPr>
+                          <w:sz w:val="16"/>
+                          <w:szCs w:val="16"/>
+                        </w:rPr>
+                        <w:fldChar w:fldCharType="separate"/>
+                      </w:r>
+                      <w:r>
+                        <w:rPr>
+                          <w:noProof/>
+                          <w:sz w:val="16"/>
+                          <w:szCs w:val="16"/>
+                        </w:rPr>
+                        <w:t>2</w:t>
+                      </w:r>
+                      <w:r>
+                        <w:rPr>
+                          <w:sz w:val="16"/>
+                          <w:szCs w:val="16"/>
+                        </w:rPr>
+                        <w:fldChar w:fldCharType="end"/>
+                      </w:r>
+                      <w:bookmarkEnd w:id="11"/>
+                      <w:r>
+                        <w:rPr>
+                          <w:sz w:val="16"/>
+                          <w:szCs w:val="16"/>
+                        </w:rPr>
+                        <w:t>: Profile options</w:t>
+                      </w:r>
+                    </w:p>
+                  </w:txbxContent>
+                </v:textbox>
+                <w10:wrap type="square"/>
+              </v:shape>
+            </w:pict>
+          </mc:Fallback>
+        </mc:AlternateContent>
+      </w:r>
+      <w:r>
+        <w:t xml:space="preserve">The </w:t>
+      </w:r>
+      <w:r>
+        <w:t>option “View Profile” leads</w:t>
+      </w:r>
+      <w:r>
+        <w:t xml:space="preserve"> to a profile overview page that contains additional navigation options and user-specific information.</w:t>
+      </w:r>
+      <w:r>
+        <w:t xml:space="preserve"> </w:t>
+      </w:r>
+      <w:r>
+        <w:t xml:space="preserve">The “Games” tab </w:t>
+      </w:r>
+      <w:r>
+        <w:t>(</w:t>
+      </w:r>
+      <w:r>
+        <w:fldChar w:fldCharType="begin"/>
+      </w:r>
+      <w:r>
+        <w:instrText xml:space="preserve"> REF _Ref226403496 \h </w:instrText>
+      </w:r>
+      <w:r>
+        <w:instrText xml:space="preserve"> \* MERGEFORMAT </w:instrText>
+      </w:r>
+      <w:r>
+        <w:fldChar w:fldCharType="separate"/>
+      </w:r>
+      <w:r>
+        <w:t>Figure 3</w:t>
+      </w:r>
+      <w:r>
+        <w:fldChar w:fldCharType="end"/>
+      </w:r>
+      <w:r>
+        <w:t xml:space="preserve">) </w:t>
+      </w:r>
+      <w:r>
+        <w:t>under a user profile provides an overview of the user’s board game collection</w:t>
+      </w:r>
+      <w:r>
+        <w:t>, which allows the user to have a quick overview of their collection, but doesn’t provide detailed information</w:t>
+      </w:r>
+      <w:r>
+        <w:t xml:space="preserve">. </w:t>
+      </w:r>
+    </w:p>
+    <w:p>
+      <w:r>
+        <w:t>T</w:t>
+      </w:r>
+      <w:r>
+        <w:t>he views available within the profile overview differ from those accessible through the main navigation menu. This creates an inconsistency in the navigation structure, as similar functionality is accessible through multiple entry points with different layouts and options. From a usability perspective, this may lead to confusion for users, as it is not always clear where specific information or functionality can be found, and users may need to explore multiple navigation paths to locate the desired features.</w:t>
+      </w:r>
+    </w:p>
+    <w:p/>
+    <w:p>
+      <w:pPr>
+        <w:keepNext/>
+        <w:jc w:val="right"/>
+      </w:pPr>
+    </w:p>
+    <w:p/>
+    <w:p>
+      <w:pPr>
+        <w:spacing w:after="0"/>
+      </w:pPr>
+      <w:r>
+        <w:lastRenderedPageBreak/>
+        <w:drawing>
+          <wp:inline distT="0" distB="0" distL="0" distR="0" wp14:anchorId="00A1E3E2" wp14:editId="40F938FD">
+            <wp:extent cx="5731510" cy="2760345"/>
+            <wp:effectExtent l="0" t="0" r="2540" b="1905"/>
+            <wp:docPr id="361949856" name="Afbeelding 1"/>
+            <wp:cNvGraphicFramePr>
+              <a:graphicFrameLocks xmlns:a="http://schemas.openxmlformats.org/drawingml/2006/main" noChangeAspect="1"/>
+            </wp:cNvGraphicFramePr>
+            <a:graphic xmlns:a="http://schemas.openxmlformats.org/drawingml/2006/main">
+              <a:graphicData uri="http://schemas.openxmlformats.org/drawingml/2006/picture">
+                <pic:pic xmlns:pic="http://schemas.openxmlformats.org/drawingml/2006/picture">
+                  <pic:nvPicPr>
+                    <pic:cNvPr id="361949856" name=""/>
+                    <pic:cNvPicPr/>
+                  </pic:nvPicPr>
+                  <pic:blipFill>
+                    <a:blip r:embed="rId17"/>
+                    <a:stretch>
+                      <a:fillRect/>
+                    </a:stretch>
+                  </pic:blipFill>
+                  <pic:spPr>
+                    <a:xfrm>
+                      <a:off x="0" y="0"/>
+                      <a:ext cx="5731510" cy="2760345"/>
+                    </a:xfrm>
+                    <a:prstGeom prst="rect">
+                      <a:avLst/>
+                    </a:prstGeom>
+                  </pic:spPr>
+                </pic:pic>
+              </a:graphicData>
+            </a:graphic>
+          </wp:inline>
+        </w:drawing>
+      </w:r>
+    </w:p>
+    <w:p>
+      <w:pPr>
+        <w:pStyle w:val="Bijschrift"/>
+        <w:jc w:val="right"/>
+        <w:rPr>
+          <w:sz w:val="16"/>
+          <w:szCs w:val="16"/>
+        </w:rPr>
+      </w:pPr>
+      <w:bookmarkStart w:id="12" w:name="_Ref226403436"/>
+      <w:bookmarkStart w:id="13" w:name="_Ref226403496"/>
+      <w:r>
+        <w:rPr>
+          <w:sz w:val="16"/>
+          <w:szCs w:val="16"/>
+        </w:rPr>
+        <w:t xml:space="preserve">Figure </w:t>
+      </w:r>
+      <w:r>
+        <w:rPr>
+          <w:sz w:val="16"/>
+          <w:szCs w:val="16"/>
+        </w:rPr>
+        <w:fldChar w:fldCharType="begin"/>
+      </w:r>
+      <w:r>
+        <w:rPr>
+          <w:sz w:val="16"/>
+          <w:szCs w:val="16"/>
+        </w:rPr>
+        <w:instrText xml:space="preserve"> SEQ Figure \* ARABIC </w:instrText>
+      </w:r>
+      <w:r>
+        <w:rPr>
+          <w:sz w:val="16"/>
+          <w:szCs w:val="16"/>
+        </w:rPr>
+        <w:fldChar w:fldCharType="separate"/>
+      </w:r>
+      <w:r>
+        <w:rPr>
+          <w:noProof/>
+          <w:sz w:val="16"/>
+          <w:szCs w:val="16"/>
+        </w:rPr>
+        <w:t>3</w:t>
+      </w:r>
+      <w:r>
+        <w:rPr>
+          <w:sz w:val="16"/>
+          <w:szCs w:val="16"/>
+        </w:rPr>
+        <w:fldChar w:fldCharType="end"/>
+      </w:r>
+      <w:bookmarkEnd w:id="13"/>
+      <w:r>
+        <w:rPr>
+          <w:sz w:val="16"/>
+          <w:szCs w:val="16"/>
+        </w:rPr>
+        <w:t>: Profile page “games”-tab</w:t>
+      </w:r>
+      <w:bookmarkEnd w:id="12"/>
+    </w:p>
+    <w:p>
+      <w:r>
+        <w:t>T</w:t>
+      </w:r>
+      <w:r>
+        <w:t>he views available within the profile overview differ from those accessible through the main navigation menu. This creates an inconsistency in the navigation structure, as similar functionality is accessible through multiple entry points with different layouts and options. From a usability perspective, this may lead to confusion for users, as it is not always clear where specific information or functionality can be found, and users may need to explore multiple navigation paths to locate the desired features.</w:t>
+      </w:r>
+    </w:p>
+    <w:p>
+      <w:r>
+        <w:t>T</w:t>
+      </w:r>
+      <w:r>
+        <w:t xml:space="preserve">he quick options menu </w:t>
+      </w:r>
+      <w:r>
+        <w:t xml:space="preserve">links to different views, including the collection and </w:t>
+      </w:r>
+      <w:proofErr w:type="spellStart"/>
+      <w:r>
+        <w:t>wishlist</w:t>
+      </w:r>
+      <w:proofErr w:type="spellEnd"/>
+      <w:r>
+        <w:t xml:space="preserve"> pages</w:t>
+      </w:r>
+      <w:r>
+        <w:t>, can be selec</w:t>
+      </w:r>
+      <w:r>
+        <w:t>t</w:t>
+      </w:r>
+      <w:r>
+        <w:t>ed</w:t>
+      </w:r>
+      <w:r>
+        <w:t>. The collection view presents a long, table-based list containing game titles, versions, user ratings, BoardGameGeek ratings, ownership status, number of plays, and personal comments</w:t>
+      </w:r>
+      <w:r>
+        <w:t xml:space="preserve"> (</w:t>
+      </w:r>
+      <w:r>
+        <w:fldChar w:fldCharType="begin"/>
+      </w:r>
+      <w:r>
+        <w:instrText xml:space="preserve"> REF _Ref226405875 \h </w:instrText>
+      </w:r>
+      <w:r>
+        <w:instrText xml:space="preserve"> \* MERGEFORMAT </w:instrText>
+      </w:r>
+      <w:r>
+        <w:fldChar w:fldCharType="separate"/>
+      </w:r>
+      <w:r>
+        <w:t>Figure 4</w:t>
+      </w:r>
+      <w:r>
+        <w:fldChar w:fldCharType="end"/>
+      </w:r>
+      <w:r>
+        <w:t>)</w:t>
+      </w:r>
+      <w:r>
+        <w:t xml:space="preserve">. The </w:t>
+      </w:r>
+      <w:proofErr w:type="spellStart"/>
+      <w:r>
+        <w:t>wishlist</w:t>
+      </w:r>
+      <w:proofErr w:type="spellEnd"/>
+      <w:r>
+        <w:t xml:space="preserve"> view uses a similar structure but includes game images instead of a text-only list and provides less detailed information than the collection view.</w:t>
+      </w:r>
+    </w:p>
+    <w:p>
+      <w:pPr>
+        <w:keepNext/>
+        <w:spacing w:after="0"/>
+      </w:pPr>
+      <w:r>
+        <w:drawing>
+          <wp:inline distT="0" distB="0" distL="0" distR="0" wp14:anchorId="3B4F0933" wp14:editId="01254773">
+            <wp:extent cx="5731510" cy="2749550"/>
+            <wp:effectExtent l="0" t="0" r="2540" b="0"/>
+            <wp:docPr id="747654272" name="Afbeelding 1"/>
+            <wp:cNvGraphicFramePr>
+              <a:graphicFrameLocks xmlns:a="http://schemas.openxmlformats.org/drawingml/2006/main" noChangeAspect="1"/>
+            </wp:cNvGraphicFramePr>
+            <a:graphic xmlns:a="http://schemas.openxmlformats.org/drawingml/2006/main">
+              <a:graphicData uri="http://schemas.openxmlformats.org/drawingml/2006/picture">
+                <pic:pic xmlns:pic="http://schemas.openxmlformats.org/drawingml/2006/picture">
+                  <pic:nvPicPr>
+                    <pic:cNvPr id="747654272" name=""/>
+                    <pic:cNvPicPr/>
+                  </pic:nvPicPr>
+                  <pic:blipFill>
+                    <a:blip r:embed="rId18"/>
+                    <a:stretch>
+                      <a:fillRect/>
+                    </a:stretch>
+                  </pic:blipFill>
+                  <pic:spPr>
+                    <a:xfrm>
+                      <a:off x="0" y="0"/>
+                      <a:ext cx="5731510" cy="2749550"/>
+                    </a:xfrm>
+                    <a:prstGeom prst="rect">
+                      <a:avLst/>
+                    </a:prstGeom>
+                  </pic:spPr>
+                </pic:pic>
+              </a:graphicData>
+            </a:graphic>
+          </wp:inline>
+        </w:drawing>
+      </w:r>
+    </w:p>
+    <w:p>
+      <w:pPr>
+        <w:pStyle w:val="Bijschrift"/>
+        <w:jc w:val="right"/>
+        <w:rPr>
+          <w:sz w:val="16"/>
+          <w:szCs w:val="16"/>
+        </w:rPr>
+      </w:pPr>
+      <w:bookmarkStart w:id="14" w:name="_Ref226405875"/>
+      <w:r>
+        <w:rPr>
+          <w:sz w:val="16"/>
+          <w:szCs w:val="16"/>
+        </w:rPr>
+        <w:t xml:space="preserve">Figure </w:t>
+      </w:r>
+      <w:r>
+        <w:rPr>
+          <w:sz w:val="16"/>
+          <w:szCs w:val="16"/>
+        </w:rPr>
+        <w:fldChar w:fldCharType="begin"/>
+      </w:r>
+      <w:r>
+        <w:rPr>
+          <w:sz w:val="16"/>
+          <w:szCs w:val="16"/>
+        </w:rPr>
+        <w:instrText xml:space="preserve"> SEQ Figure \* ARABIC </w:instrText>
+      </w:r>
+      <w:r>
+        <w:rPr>
+          <w:sz w:val="16"/>
+          <w:szCs w:val="16"/>
+        </w:rPr>
+        <w:fldChar w:fldCharType="separate"/>
+      </w:r>
+      <w:r>
+        <w:rPr>
+          <w:noProof/>
+          <w:sz w:val="16"/>
+          <w:szCs w:val="16"/>
+        </w:rPr>
+        <w:t>4</w:t>
+      </w:r>
+      <w:r>
+        <w:rPr>
+          <w:sz w:val="16"/>
+          <w:szCs w:val="16"/>
+        </w:rPr>
+        <w:fldChar w:fldCharType="end"/>
+      </w:r>
+      <w:bookmarkEnd w:id="14"/>
+      <w:r>
+        <w:rPr>
+          <w:sz w:val="16"/>
+          <w:szCs w:val="16"/>
+        </w:rPr>
+        <w:t>: Main 'Collection' page</w:t>
+      </w:r>
+    </w:p>
+    <w:p>
+      <w:pPr>
+        <w:keepNext/>
+        <w:spacing w:after="0"/>
+      </w:pPr>
+      <w:r>
+        <w:lastRenderedPageBreak/>
+        <w:drawing>
+          <wp:inline distT="0" distB="0" distL="0" distR="0" wp14:anchorId="06342D1B" wp14:editId="20518889">
+            <wp:extent cx="5731510" cy="2745105"/>
+            <wp:effectExtent l="0" t="0" r="2540" b="0"/>
+            <wp:docPr id="51461268" name="Afbeelding 1"/>
+            <wp:cNvGraphicFramePr>
+              <a:graphicFrameLocks xmlns:a="http://schemas.openxmlformats.org/drawingml/2006/main" noChangeAspect="1"/>
+            </wp:cNvGraphicFramePr>
+            <a:graphic xmlns:a="http://schemas.openxmlformats.org/drawingml/2006/main">
+              <a:graphicData uri="http://schemas.openxmlformats.org/drawingml/2006/picture">
+                <pic:pic xmlns:pic="http://schemas.openxmlformats.org/drawingml/2006/picture">
+                  <pic:nvPicPr>
+                    <pic:cNvPr id="51461268" name=""/>
+                    <pic:cNvPicPr/>
+                  </pic:nvPicPr>
+                  <pic:blipFill>
+                    <a:blip r:embed="rId19"/>
+                    <a:stretch>
+                      <a:fillRect/>
+                    </a:stretch>
+                  </pic:blipFill>
+                  <pic:spPr>
+                    <a:xfrm>
+                      <a:off x="0" y="0"/>
+                      <a:ext cx="5731510" cy="2745105"/>
+                    </a:xfrm>
+                    <a:prstGeom prst="rect">
+                      <a:avLst/>
+                    </a:prstGeom>
+                  </pic:spPr>
+                </pic:pic>
+              </a:graphicData>
+            </a:graphic>
+          </wp:inline>
+        </w:drawing>
+      </w:r>
+    </w:p>
+    <w:p>
+      <w:pPr>
+        <w:pStyle w:val="Bijschrift"/>
+        <w:jc w:val="right"/>
+      </w:pPr>
+      <w:r>
+        <w:t xml:space="preserve">Figure </w:t>
+      </w:r>
+      <w:r>
+        <w:fldChar w:fldCharType="begin"/>
+      </w:r>
+      <w:r>
+        <w:instrText xml:space="preserve"> SEQ Figure \* ARABIC </w:instrText>
+      </w:r>
+      <w:r>
+        <w:fldChar w:fldCharType="separate"/>
+      </w:r>
+      <w:r>
+        <w:rPr>
+          <w:noProof/>
+        </w:rPr>
+        <w:t>5</w:t>
+      </w:r>
+      <w:r>
+        <w:fldChar w:fldCharType="end"/>
+      </w:r>
+      <w:r>
+        <w:t>: Wish-list</w:t>
+      </w:r>
+    </w:p>
+    <w:p>
+      <w:r>
+        <w:t xml:space="preserve">From a usability perspective, neither view offers an efficient overview of a user’s collection. The collection view is highly data-dense and primarily text-based, making it difficult to quickly understand the composition of the collection. The </w:t>
+      </w:r>
+      <w:proofErr w:type="spellStart"/>
+      <w:r>
+        <w:t>wishlist</w:t>
+      </w:r>
+      <w:proofErr w:type="spellEnd"/>
+      <w:r>
+        <w:t xml:space="preserve"> view improves visual recognition by including images, but still lacks structured filtering or summarisation that would help users identify patterns or categories within their games. As a result, it requires considerable effort for users to determine what types of games are present in a collection or </w:t>
+      </w:r>
+      <w:proofErr w:type="spellStart"/>
+      <w:r>
+        <w:t>wishlist</w:t>
+      </w:r>
+      <w:proofErr w:type="spellEnd"/>
+      <w:r>
+        <w:t>, limiting the effectiveness of these views for quick analysis or exploration.</w:t>
+      </w:r>
+    </w:p>
+    <w:p/>
     <w:p>
       <w:pPr>
         <w:pStyle w:val="Kop2"/>
@@ -2721,190 +3588,6 @@
       <w:proofErr w:type="spellEnd"/>
     </w:p>
     <w:p/>
-    <w:p>
-      <w:pPr>
-        <w:pStyle w:val="Kop1"/>
-      </w:pPr>
-      <w:bookmarkStart w:id="10" w:name="_Toc226315632"/>
-      <w:r>
-        <w:t>Task analysis</w:t>
-      </w:r>
-      <w:bookmarkEnd w:id="10"/>
-    </w:p>
-    <w:p>
-      <w:r>
-        <w:t xml:space="preserve">Typical </w:t>
-      </w:r>
-      <w:r>
-        <w:t xml:space="preserve">functionalities for data-driven gamers </w:t>
-      </w:r>
-      <w:r>
-        <w:t>include</w:t>
-      </w:r>
-      <w:r>
-        <w:t xml:space="preserve"> </w:t>
-      </w:r>
-      <w:r>
-        <w:t>logging every game played</w:t>
-      </w:r>
-      <w:r>
-        <w:t xml:space="preserve">; </w:t>
-      </w:r>
-      <w:r>
-        <w:t>tracking players, scores, wins and losses</w:t>
-      </w:r>
-      <w:r>
-        <w:t xml:space="preserve">; </w:t>
-      </w:r>
-      <w:r>
-        <w:t>recording playtime and locations</w:t>
-      </w:r>
-      <w:r>
-        <w:t>;</w:t>
-      </w:r>
-      <w:r>
-        <w:t xml:space="preserve"> </w:t>
-      </w:r>
-      <w:r>
-        <w:t>managing and analysing their game collection</w:t>
-      </w:r>
-      <w:r>
-        <w:t xml:space="preserve">; </w:t>
-      </w:r>
-      <w:r>
-        <w:t>monitoring play frequency and trends</w:t>
-      </w:r>
-      <w:r>
-        <w:t>;</w:t>
-      </w:r>
-      <w:r>
-        <w:t xml:space="preserve"> </w:t>
-      </w:r>
-      <w:r>
-        <w:t>using statistics to evaluate their gaming habits</w:t>
-      </w:r>
-      <w:r>
-        <w:t xml:space="preserve">; </w:t>
-      </w:r>
-      <w:r>
-        <w:t>integrating tools and databases into their hobby</w:t>
-      </w:r>
-      <w:r>
-        <w:t>.</w:t>
-      </w:r>
-      <w:r>
-        <w:t xml:space="preserve"> For these players, board</w:t>
-      </w:r>
-      <w:r>
-        <w:t xml:space="preserve"> </w:t>
-      </w:r>
-      <w:r>
-        <w:t>gaming becomes both a social and analytical activity.</w:t>
-      </w:r>
-    </w:p>
-    <w:p>
-      <w:r>
-        <w:t>Define:</w:t>
-      </w:r>
-    </w:p>
-    <w:p>
-      <w:pPr>
-        <w:numPr>
-          <w:ilvl w:val="0"/>
-          <w:numId w:val="14"/>
-        </w:numPr>
-      </w:pPr>
-      <w:r>
-        <w:t>Which tasks are core vs. supporting.</w:t>
-      </w:r>
-    </w:p>
-    <w:p>
-      <w:pPr>
-        <w:numPr>
-          <w:ilvl w:val="0"/>
-          <w:numId w:val="14"/>
-        </w:numPr>
-      </w:pPr>
-      <w:r>
-        <w:t>Task decomposition.</w:t>
-      </w:r>
-    </w:p>
-    <w:p>
-      <w:pPr>
-        <w:numPr>
-          <w:ilvl w:val="0"/>
-          <w:numId w:val="14"/>
-        </w:numPr>
-      </w:pPr>
-      <w:r>
-        <w:t>Task-to-feature mapping.</w:t>
-      </w:r>
-    </w:p>
-    <w:p>
-      <w:pPr>
-        <w:numPr>
-          <w:ilvl w:val="0"/>
-          <w:numId w:val="14"/>
-        </w:numPr>
-        <w:spacing w:after="0"/>
-      </w:pPr>
-      <w:r>
-        <w:t>User Stories</w:t>
-      </w:r>
-    </w:p>
-    <w:p/>
-    <w:p>
-      <w:r>
-        <w:t>What tasks users perform</w:t>
-      </w:r>
-      <w:r>
-        <w:t>:</w:t>
-      </w:r>
-    </w:p>
-    <w:p>
-      <w:pPr>
-        <w:numPr>
-          <w:ilvl w:val="0"/>
-          <w:numId w:val="14"/>
-        </w:numPr>
-      </w:pPr>
-      <w:r>
-        <w:t>Maintain a comprehensive overview of their board game collection.</w:t>
-      </w:r>
-    </w:p>
-    <w:p>
-      <w:pPr>
-        <w:numPr>
-          <w:ilvl w:val="0"/>
-          <w:numId w:val="14"/>
-        </w:numPr>
-      </w:pPr>
-      <w:r>
-        <w:t>Identify patterns in play frequency, wins, and player preferences.</w:t>
-      </w:r>
-    </w:p>
-    <w:p>
-      <w:pPr>
-        <w:numPr>
-          <w:ilvl w:val="0"/>
-          <w:numId w:val="14"/>
-        </w:numPr>
-      </w:pPr>
-      <w:r>
-        <w:t>Streamline game selection to reduce decision friction.</w:t>
-      </w:r>
-    </w:p>
-    <w:p>
-      <w:pPr>
-        <w:numPr>
-          <w:ilvl w:val="0"/>
-          <w:numId w:val="14"/>
-        </w:numPr>
-      </w:pPr>
-      <w:r>
-        <w:t>Experiment with novel features for personal enjoyment.</w:t>
-      </w:r>
-    </w:p>
     <w:p>
       <w:pPr>
         <w:rPr>
@@ -2914,6 +3597,7 @@
           <w:szCs w:val="40"/>
         </w:rPr>
       </w:pPr>
+      <w:bookmarkStart w:id="15" w:name="_Toc226315632"/>
       <w:r>
         <w:br w:type="page"/>
       </w:r>
@@ -2922,35 +3606,184 @@
       <w:pPr>
         <w:pStyle w:val="Kop1"/>
       </w:pPr>
-      <w:bookmarkStart w:id="11" w:name="_Toc226315633"/>
       <w:r>
         <w:lastRenderedPageBreak/>
-        <w:t>Design Ideas</w:t>
-      </w:r>
-      <w:bookmarkEnd w:id="11"/>
+        <w:t>Task analysis</w:t>
+      </w:r>
+      <w:bookmarkEnd w:id="15"/>
     </w:p>
     <w:p>
-      <w:pPr>
-        <w:pStyle w:val="Lijstalinea"/>
+      <w:r>
+        <w:t xml:space="preserve">Typical </w:t>
+      </w:r>
+      <w:r>
+        <w:t xml:space="preserve">functionalities for data-driven gamers </w:t>
+      </w:r>
+      <w:r>
+        <w:t>include</w:t>
+      </w:r>
+      <w:r>
+        <w:t xml:space="preserve"> </w:t>
+      </w:r>
+      <w:r>
+        <w:t>logging every game played</w:t>
+      </w:r>
+      <w:r>
+        <w:t xml:space="preserve">; </w:t>
+      </w:r>
+      <w:r>
+        <w:t>tracking players, scores, wins and losses</w:t>
+      </w:r>
+      <w:r>
+        <w:t xml:space="preserve">; </w:t>
+      </w:r>
+      <w:r>
+        <w:t>recording playtime and locations</w:t>
+      </w:r>
+      <w:r>
+        <w:t>;</w:t>
+      </w:r>
+      <w:r>
+        <w:t xml:space="preserve"> </w:t>
+      </w:r>
+      <w:r>
+        <w:t>managing and analysing their game collection</w:t>
+      </w:r>
+      <w:r>
+        <w:t xml:space="preserve">; </w:t>
+      </w:r>
+      <w:r>
+        <w:t>monitoring play frequency and trends</w:t>
+      </w:r>
+      <w:r>
+        <w:t>;</w:t>
+      </w:r>
+      <w:r>
+        <w:t xml:space="preserve"> </w:t>
+      </w:r>
+      <w:r>
+        <w:t>using statistics to evaluate their gaming habits</w:t>
+      </w:r>
+      <w:r>
+        <w:t xml:space="preserve">; </w:t>
+      </w:r>
+      <w:r>
+        <w:t>integrating tools and databases into their hobby</w:t>
+      </w:r>
+      <w:r>
+        <w:t>.</w:t>
+      </w:r>
+      <w:r>
+        <w:t xml:space="preserve"> For these players, board</w:t>
+      </w:r>
+      <w:r>
+        <w:t xml:space="preserve"> </w:t>
+      </w:r>
+      <w:r>
+        <w:t>gaming becomes both a social and analytical activity.</w:t>
+      </w:r>
+    </w:p>
+    <w:p>
+      <w:r>
+        <w:t>Define:</w:t>
+      </w:r>
+    </w:p>
+    <w:p>
+      <w:pPr>
         <w:numPr>
           <w:ilvl w:val="0"/>
           <w:numId w:val="14"/>
         </w:numPr>
       </w:pPr>
       <w:r>
-        <w:t>Theme</w:t>
+        <w:t>Which tasks are core vs. supporting.</w:t>
       </w:r>
     </w:p>
     <w:p>
       <w:pPr>
-        <w:pStyle w:val="Lijstalinea"/>
         <w:numPr>
           <w:ilvl w:val="0"/>
           <w:numId w:val="14"/>
         </w:numPr>
       </w:pPr>
       <w:r>
-        <w:t>Overall look -and-feel</w:t>
+        <w:t>Task decomposition.</w:t>
+      </w:r>
+    </w:p>
+    <w:p>
+      <w:pPr>
+        <w:numPr>
+          <w:ilvl w:val="0"/>
+          <w:numId w:val="14"/>
+        </w:numPr>
+      </w:pPr>
+      <w:r>
+        <w:t>Task-to-feature mapping.</w:t>
+      </w:r>
+    </w:p>
+    <w:p>
+      <w:pPr>
+        <w:numPr>
+          <w:ilvl w:val="0"/>
+          <w:numId w:val="14"/>
+        </w:numPr>
+        <w:spacing w:after="0"/>
+      </w:pPr>
+      <w:r>
+        <w:t>User Stories</w:t>
+      </w:r>
+    </w:p>
+    <w:p/>
+    <w:p>
+      <w:r>
+        <w:t>What tasks users perform</w:t>
+      </w:r>
+      <w:r>
+        <w:t>:</w:t>
+      </w:r>
+    </w:p>
+    <w:p>
+      <w:pPr>
+        <w:numPr>
+          <w:ilvl w:val="0"/>
+          <w:numId w:val="14"/>
+        </w:numPr>
+      </w:pPr>
+      <w:r>
+        <w:t>Maintain a comprehensive overview of their board game collection.</w:t>
+      </w:r>
+    </w:p>
+    <w:p>
+      <w:pPr>
+        <w:numPr>
+          <w:ilvl w:val="0"/>
+          <w:numId w:val="14"/>
+        </w:numPr>
+      </w:pPr>
+      <w:r>
+        <w:t>Identify patterns in play frequency, wins, and player preferences.</w:t>
+      </w:r>
+    </w:p>
+    <w:p>
+      <w:pPr>
+        <w:numPr>
+          <w:ilvl w:val="0"/>
+          <w:numId w:val="14"/>
+        </w:numPr>
+      </w:pPr>
+      <w:r>
+        <w:t>Streamline game selection to reduce decision friction.</w:t>
+      </w:r>
+    </w:p>
+    <w:p>
+      <w:pPr>
+        <w:numPr>
+          <w:ilvl w:val="0"/>
+          <w:numId w:val="14"/>
+        </w:numPr>
+      </w:pPr>
+      <w:r>
+        <w:t>Experiment with novel features for personal enjoyment.</w:t>
       </w:r>
     </w:p>
     <w:p>
@@ -2962,7 +3795,6 @@
           <w:szCs w:val="40"/>
         </w:rPr>
       </w:pPr>
-      <w:bookmarkStart w:id="12" w:name="_Toc215063124"/>
       <w:r>
         <w:br w:type="page"/>
       </w:r>
@@ -2971,19 +3803,12 @@
       <w:pPr>
         <w:pStyle w:val="Kop1"/>
       </w:pPr>
-      <w:bookmarkStart w:id="13" w:name="_Toc226315634"/>
+      <w:bookmarkStart w:id="16" w:name="_Toc226315633"/>
       <w:r>
         <w:lastRenderedPageBreak/>
-        <w:t>Use case</w:t>
-      </w:r>
-      <w:r>
-        <w:t xml:space="preserve"> </w:t>
-      </w:r>
-      <w:bookmarkEnd w:id="12"/>
-      <w:r>
-        <w:t>model</w:t>
-      </w:r>
-      <w:bookmarkEnd w:id="13"/>
+        <w:t>Design Ideas</w:t>
+      </w:r>
+      <w:bookmarkEnd w:id="16"/>
     </w:p>
     <w:p>
       <w:pPr>
@@ -2994,19 +3819,75 @@
         </w:numPr>
       </w:pPr>
       <w:r>
-        <w:t>UC-Diagram and overall description</w:t>
+        <w:t>Theme</w:t>
       </w:r>
     </w:p>
     <w:p>
       <w:pPr>
+        <w:pStyle w:val="Lijstalinea"/>
+        <w:numPr>
+          <w:ilvl w:val="0"/>
+          <w:numId w:val="14"/>
+        </w:numPr>
+      </w:pPr>
+      <w:r>
+        <w:t>Overall look -and-feel</w:t>
+      </w:r>
+    </w:p>
+    <w:p>
+      <w:pPr>
+        <w:rPr>
+          <w:rFonts w:asciiTheme="majorHAnsi" w:eastAsiaTheme="majorEastAsia" w:hAnsiTheme="majorHAnsi" w:cstheme="majorBidi"/>
+          <w:color w:val="2F5496" w:themeColor="accent1" w:themeShade="BF"/>
+          <w:sz w:val="40"/>
+          <w:szCs w:val="40"/>
+        </w:rPr>
+      </w:pPr>
+      <w:bookmarkStart w:id="17" w:name="_Toc215063124"/>
+      <w:r>
+        <w:br w:type="page"/>
+      </w:r>
+    </w:p>
+    <w:p>
+      <w:pPr>
+        <w:pStyle w:val="Kop1"/>
+      </w:pPr>
+      <w:bookmarkStart w:id="18" w:name="_Toc226315634"/>
+      <w:r>
+        <w:lastRenderedPageBreak/>
+        <w:t>Use case</w:t>
+      </w:r>
+      <w:r>
+        <w:t xml:space="preserve"> </w:t>
+      </w:r>
+      <w:bookmarkEnd w:id="17"/>
+      <w:r>
+        <w:t>model</w:t>
+      </w:r>
+      <w:bookmarkEnd w:id="18"/>
+    </w:p>
+    <w:p>
+      <w:pPr>
+        <w:pStyle w:val="Lijstalinea"/>
+        <w:numPr>
+          <w:ilvl w:val="0"/>
+          <w:numId w:val="14"/>
+        </w:numPr>
+      </w:pPr>
+      <w:r>
+        <w:t>UC-Diagram and overall description</w:t>
+      </w:r>
+    </w:p>
+    <w:p>
+      <w:pPr>
         <w:pStyle w:val="Kop2"/>
       </w:pPr>
-      <w:bookmarkStart w:id="14" w:name="_Toc226315635"/>
+      <w:bookmarkStart w:id="19" w:name="_Toc226315635"/>
       <w:proofErr w:type="spellStart"/>
       <w:r>
         <w:t>UC.x</w:t>
       </w:r>
-      <w:bookmarkEnd w:id="14"/>
+      <w:bookmarkEnd w:id="19"/>
       <w:proofErr w:type="spellEnd"/>
     </w:p>
     <w:tbl>
@@ -4305,7 +5186,7 @@
       <w:pPr>
         <w:pStyle w:val="Kop3"/>
       </w:pPr>
-      <w:bookmarkStart w:id="15" w:name="_Toc226315636"/>
+      <w:bookmarkStart w:id="20" w:name="_Toc226315636"/>
       <w:r>
         <w:t xml:space="preserve">Lo-Fi Prototype </w:t>
       </w:r>
@@ -4313,7 +5194,7 @@
       <w:r>
         <w:t>UC.x</w:t>
       </w:r>
-      <w:bookmarkEnd w:id="15"/>
+      <w:bookmarkEnd w:id="20"/>
       <w:proofErr w:type="spellEnd"/>
     </w:p>
     <w:p>
@@ -4329,7 +5210,7 @@
         <w:br w:type="page"/>
       </w:r>
     </w:p>
-    <w:bookmarkStart w:id="16" w:name="_Toc226315637" w:displacedByCustomXml="next"/>
+    <w:bookmarkStart w:id="21" w:name="_Toc226315637" w:displacedByCustomXml="next"/>
     <w:sdt>
       <w:sdtPr>
         <w:rPr>
@@ -4352,7 +5233,7 @@
           <w:r>
             <w:t>References</w:t>
           </w:r>
-          <w:bookmarkEnd w:id="16"/>
+          <w:bookmarkEnd w:id="21"/>
         </w:p>
         <w:sdt>
           <w:sdtPr>
@@ -4670,9 +5551,9 @@
     </w:sdt>
     <w:p/>
     <w:sectPr>
-      <w:headerReference w:type="default" r:id="rId15"/>
-      <w:footerReference w:type="default" r:id="rId16"/>
-      <w:footerReference w:type="first" r:id="rId17"/>
+      <w:headerReference w:type="default" r:id="rId20"/>
+      <w:footerReference w:type="default" r:id="rId21"/>
+      <w:footerReference w:type="first" r:id="rId22"/>
       <w:pgSz w:w="11906" w:h="16838"/>
       <w:pgMar w:top="1440" w:right="1440" w:bottom="1440" w:left="1440" w:header="708" w:footer="708" w:gutter="0"/>
       <w:pgNumType w:start="0"/>
@@ -4833,7 +5714,7 @@
         <w:noProof/>
         <w:color w:val="002060"/>
       </w:rPr>
-      <w:t>05/04/2026</w:t>
+      <w:t>06/04/2026</w:t>
     </w:r>
     <w:r>
       <w:rPr>
@@ -4855,20 +5736,12 @@
       </w:rPr>
       <w:t xml:space="preserve">Gir </w:t>
     </w:r>
-    <w:proofErr w:type="spellStart"/>
     <w:r>
       <w:rPr>
         <w:color w:val="002060"/>
       </w:rPr>
-      <w:t>Repro</w:t>
+      <w:t>Repository</w:t>
     </w:r>
-    <w:r>
-      <w:rPr>
-        <w:color w:val="002060"/>
-      </w:rPr>
-      <w:t>sitory</w:t>
-    </w:r>
-    <w:proofErr w:type="spellEnd"/>
     <w:r>
       <w:rPr>
         <w:color w:val="002060"/>
@@ -5628,6 +6501,119 @@
     </w:lvl>
   </w:abstractNum>
   <w:abstractNum w:abstractNumId="5" w15:restartNumberingAfterBreak="0">
+    <w:nsid w:val="1EFF436E"/>
+    <w:multiLevelType w:val="hybridMultilevel"/>
+    <w:tmpl w:val="39049BE0"/>
+    <w:lvl w:ilvl="0" w:tplc="04130001">
+      <w:start w:val="1"/>
+      <w:numFmt w:val="bullet"/>
+      <w:lvlText w:val=""/>
+      <w:lvlJc w:val="left"/>
+      <w:pPr>
+        <w:ind w:left="720" w:hanging="360"/>
+      </w:pPr>
+      <w:rPr>
+        <w:rFonts w:ascii="Symbol" w:hAnsi="Symbol" w:hint="default"/>
+      </w:rPr>
+    </w:lvl>
+    <w:lvl w:ilvl="1" w:tplc="04130003" w:tentative="1">
+      <w:start w:val="1"/>
+      <w:numFmt w:val="bullet"/>
+      <w:lvlText w:val="o"/>
+      <w:lvlJc w:val="left"/>
+      <w:pPr>
+        <w:ind w:left="1440" w:hanging="360"/>
+      </w:pPr>
+      <w:rPr>
+        <w:rFonts w:ascii="Courier New" w:hAnsi="Courier New" w:cs="Courier New" w:hint="default"/>
+      </w:rPr>
+    </w:lvl>
+    <w:lvl w:ilvl="2" w:tplc="04130005" w:tentative="1">
+      <w:start w:val="1"/>
+      <w:numFmt w:val="bullet"/>
+      <w:lvlText w:val=""/>
+      <w:lvlJc w:val="left"/>
+      <w:pPr>
+        <w:ind w:left="2160" w:hanging="360"/>
+      </w:pPr>
+      <w:rPr>
+        <w:rFonts w:ascii="Wingdings" w:hAnsi="Wingdings" w:hint="default"/>
+      </w:rPr>
+    </w:lvl>
+    <w:lvl w:ilvl="3" w:tplc="04130001" w:tentative="1">
+      <w:start w:val="1"/>
+      <w:numFmt w:val="bullet"/>
+      <w:lvlText w:val=""/>
+      <w:lvlJc w:val="left"/>
+      <w:pPr>
+        <w:ind w:left="2880" w:hanging="360"/>
+      </w:pPr>
+      <w:rPr>
+        <w:rFonts w:ascii="Symbol" w:hAnsi="Symbol" w:hint="default"/>
+      </w:rPr>
+    </w:lvl>
+    <w:lvl w:ilvl="4" w:tplc="04130003" w:tentative="1">
+      <w:start w:val="1"/>
+      <w:numFmt w:val="bullet"/>
+      <w:lvlText w:val="o"/>
+      <w:lvlJc w:val="left"/>
+      <w:pPr>
+        <w:ind w:left="3600" w:hanging="360"/>
+      </w:pPr>
+      <w:rPr>
+        <w:rFonts w:ascii="Courier New" w:hAnsi="Courier New" w:cs="Courier New" w:hint="default"/>
+      </w:rPr>
+    </w:lvl>
+    <w:lvl w:ilvl="5" w:tplc="04130005" w:tentative="1">
+      <w:start w:val="1"/>
+      <w:numFmt w:val="bullet"/>
+      <w:lvlText w:val=""/>
+      <w:lvlJc w:val="left"/>
+      <w:pPr>
+        <w:ind w:left="4320" w:hanging="360"/>
+      </w:pPr>
+      <w:rPr>
+        <w:rFonts w:ascii="Wingdings" w:hAnsi="Wingdings" w:hint="default"/>
+      </w:rPr>
+    </w:lvl>
+    <w:lvl w:ilvl="6" w:tplc="04130001" w:tentative="1">
+      <w:start w:val="1"/>
+      <w:numFmt w:val="bullet"/>
+      <w:lvlText w:val=""/>
+      <w:lvlJc w:val="left"/>
+      <w:pPr>
+        <w:ind w:left="5040" w:hanging="360"/>
+      </w:pPr>
+      <w:rPr>
+        <w:rFonts w:ascii="Symbol" w:hAnsi="Symbol" w:hint="default"/>
+      </w:rPr>
+    </w:lvl>
+    <w:lvl w:ilvl="7" w:tplc="04130003" w:tentative="1">
+      <w:start w:val="1"/>
+      <w:numFmt w:val="bullet"/>
+      <w:lvlText w:val="o"/>
+      <w:lvlJc w:val="left"/>
+      <w:pPr>
+        <w:ind w:left="5760" w:hanging="360"/>
+      </w:pPr>
+      <w:rPr>
+        <w:rFonts w:ascii="Courier New" w:hAnsi="Courier New" w:cs="Courier New" w:hint="default"/>
+      </w:rPr>
+    </w:lvl>
+    <w:lvl w:ilvl="8" w:tplc="04130005" w:tentative="1">
+      <w:start w:val="1"/>
+      <w:numFmt w:val="bullet"/>
+      <w:lvlText w:val=""/>
+      <w:lvlJc w:val="left"/>
+      <w:pPr>
+        <w:ind w:left="6480" w:hanging="360"/>
+      </w:pPr>
+      <w:rPr>
+        <w:rFonts w:ascii="Wingdings" w:hAnsi="Wingdings" w:hint="default"/>
+      </w:rPr>
+    </w:lvl>
+  </w:abstractNum>
+  <w:abstractNum w:abstractNumId="6" w15:restartNumberingAfterBreak="0">
     <w:nsid w:val="202C5CD5"/>
     <w:multiLevelType w:val="multilevel"/>
     <w:tmpl w:val="508EDBD8"/>
@@ -5776,7 +6762,7 @@
       </w:rPr>
     </w:lvl>
   </w:abstractNum>
-  <w:abstractNum w:abstractNumId="6" w15:restartNumberingAfterBreak="0">
+  <w:abstractNum w:abstractNumId="7" w15:restartNumberingAfterBreak="0">
     <w:nsid w:val="2194563C"/>
     <w:multiLevelType w:val="multilevel"/>
     <w:tmpl w:val="24289C38"/>
@@ -5925,7 +6911,7 @@
       </w:rPr>
     </w:lvl>
   </w:abstractNum>
-  <w:abstractNum w:abstractNumId="7" w15:restartNumberingAfterBreak="0">
+  <w:abstractNum w:abstractNumId="8" w15:restartNumberingAfterBreak="0">
     <w:nsid w:val="2355244E"/>
     <w:multiLevelType w:val="hybridMultilevel"/>
     <w:tmpl w:val="E7506F0E"/>
@@ -6037,7 +7023,7 @@
       </w:rPr>
     </w:lvl>
   </w:abstractNum>
-  <w:abstractNum w:abstractNumId="8" w15:restartNumberingAfterBreak="0">
+  <w:abstractNum w:abstractNumId="9" w15:restartNumberingAfterBreak="0">
     <w:nsid w:val="252B1EEF"/>
     <w:multiLevelType w:val="multilevel"/>
     <w:tmpl w:val="C9E4AB54"/>
@@ -6186,7 +7172,7 @@
       </w:rPr>
     </w:lvl>
   </w:abstractNum>
-  <w:abstractNum w:abstractNumId="9" w15:restartNumberingAfterBreak="0">
+  <w:abstractNum w:abstractNumId="10" w15:restartNumberingAfterBreak="0">
     <w:nsid w:val="25CD6614"/>
     <w:multiLevelType w:val="hybridMultilevel"/>
     <w:tmpl w:val="BBDA0BD6"/>
@@ -6298,7 +7284,7 @@
       </w:rPr>
     </w:lvl>
   </w:abstractNum>
-  <w:abstractNum w:abstractNumId="10" w15:restartNumberingAfterBreak="0">
+  <w:abstractNum w:abstractNumId="11" w15:restartNumberingAfterBreak="0">
     <w:nsid w:val="2BAE5DC7"/>
     <w:multiLevelType w:val="multilevel"/>
     <w:tmpl w:val="E0B2C8A0"/>
@@ -6447,7 +7433,7 @@
       </w:rPr>
     </w:lvl>
   </w:abstractNum>
-  <w:abstractNum w:abstractNumId="11" w15:restartNumberingAfterBreak="0">
+  <w:abstractNum w:abstractNumId="12" w15:restartNumberingAfterBreak="0">
     <w:nsid w:val="33FC115B"/>
     <w:multiLevelType w:val="multilevel"/>
     <w:tmpl w:val="1F263452"/>
@@ -6596,7 +7582,7 @@
       </w:rPr>
     </w:lvl>
   </w:abstractNum>
-  <w:abstractNum w:abstractNumId="12" w15:restartNumberingAfterBreak="0">
+  <w:abstractNum w:abstractNumId="13" w15:restartNumberingAfterBreak="0">
     <w:nsid w:val="3502591D"/>
     <w:multiLevelType w:val="multilevel"/>
     <w:tmpl w:val="F69AF3FE"/>
@@ -6745,7 +7731,7 @@
       </w:rPr>
     </w:lvl>
   </w:abstractNum>
-  <w:abstractNum w:abstractNumId="13" w15:restartNumberingAfterBreak="0">
+  <w:abstractNum w:abstractNumId="14" w15:restartNumberingAfterBreak="0">
     <w:nsid w:val="3608209E"/>
     <w:multiLevelType w:val="multilevel"/>
     <w:tmpl w:val="2CDC8256"/>
@@ -6894,7 +7880,7 @@
       </w:rPr>
     </w:lvl>
   </w:abstractNum>
-  <w:abstractNum w:abstractNumId="14" w15:restartNumberingAfterBreak="0">
+  <w:abstractNum w:abstractNumId="15" w15:restartNumberingAfterBreak="0">
     <w:nsid w:val="4C036649"/>
     <w:multiLevelType w:val="multilevel"/>
     <w:tmpl w:val="987091A2"/>
@@ -7043,7 +8029,7 @@
       </w:rPr>
     </w:lvl>
   </w:abstractNum>
-  <w:abstractNum w:abstractNumId="15" w15:restartNumberingAfterBreak="0">
+  <w:abstractNum w:abstractNumId="16" w15:restartNumberingAfterBreak="0">
     <w:nsid w:val="4D242A67"/>
     <w:multiLevelType w:val="multilevel"/>
     <w:tmpl w:val="F93E5E74"/>
@@ -7192,7 +8178,7 @@
       </w:rPr>
     </w:lvl>
   </w:abstractNum>
-  <w:abstractNum w:abstractNumId="16" w15:restartNumberingAfterBreak="0">
+  <w:abstractNum w:abstractNumId="17" w15:restartNumberingAfterBreak="0">
     <w:nsid w:val="4D783149"/>
     <w:multiLevelType w:val="hybridMultilevel"/>
     <w:tmpl w:val="49D4D6CE"/>
@@ -7304,7 +8290,120 @@
       </w:rPr>
     </w:lvl>
   </w:abstractNum>
-  <w:abstractNum w:abstractNumId="17" w15:restartNumberingAfterBreak="0">
+  <w:abstractNum w:abstractNumId="18" w15:restartNumberingAfterBreak="0">
+    <w:nsid w:val="4E2C27BA"/>
+    <w:multiLevelType w:val="hybridMultilevel"/>
+    <w:tmpl w:val="3EFEFC86"/>
+    <w:lvl w:ilvl="0" w:tplc="04130001">
+      <w:start w:val="1"/>
+      <w:numFmt w:val="bullet"/>
+      <w:lvlText w:val=""/>
+      <w:lvlJc w:val="left"/>
+      <w:pPr>
+        <w:ind w:left="360" w:hanging="360"/>
+      </w:pPr>
+      <w:rPr>
+        <w:rFonts w:ascii="Symbol" w:hAnsi="Symbol" w:hint="default"/>
+      </w:rPr>
+    </w:lvl>
+    <w:lvl w:ilvl="1" w:tplc="04130003">
+      <w:start w:val="1"/>
+      <w:numFmt w:val="bullet"/>
+      <w:lvlText w:val="o"/>
+      <w:lvlJc w:val="left"/>
+      <w:pPr>
+        <w:ind w:left="1080" w:hanging="360"/>
+      </w:pPr>
+      <w:rPr>
+        <w:rFonts w:ascii="Courier New" w:hAnsi="Courier New" w:cs="Courier New" w:hint="default"/>
+      </w:rPr>
+    </w:lvl>
+    <w:lvl w:ilvl="2" w:tplc="04130005">
+      <w:start w:val="1"/>
+      <w:numFmt w:val="bullet"/>
+      <w:lvlText w:val=""/>
+      <w:lvlJc w:val="left"/>
+      <w:pPr>
+        <w:ind w:left="1800" w:hanging="360"/>
+      </w:pPr>
+      <w:rPr>
+        <w:rFonts w:ascii="Wingdings" w:hAnsi="Wingdings" w:hint="default"/>
+      </w:rPr>
+    </w:lvl>
+    <w:lvl w:ilvl="3" w:tplc="04130001">
+      <w:start w:val="1"/>
+      <w:numFmt w:val="bullet"/>
+      <w:lvlText w:val=""/>
+      <w:lvlJc w:val="left"/>
+      <w:pPr>
+        <w:ind w:left="2520" w:hanging="360"/>
+      </w:pPr>
+      <w:rPr>
+        <w:rFonts w:ascii="Symbol" w:hAnsi="Symbol" w:hint="default"/>
+      </w:rPr>
+    </w:lvl>
+    <w:lvl w:ilvl="4" w:tplc="04130003" w:tentative="1">
+      <w:start w:val="1"/>
+      <w:numFmt w:val="bullet"/>
+      <w:lvlText w:val="o"/>
+      <w:lvlJc w:val="left"/>
+      <w:pPr>
+        <w:ind w:left="3240" w:hanging="360"/>
+      </w:pPr>
+      <w:rPr>
+        <w:rFonts w:ascii="Courier New" w:hAnsi="Courier New" w:cs="Courier New" w:hint="default"/>
+      </w:rPr>
+    </w:lvl>
+    <w:lvl w:ilvl="5" w:tplc="04130005" w:tentative="1">
+      <w:start w:val="1"/>
+      <w:numFmt w:val="bullet"/>
+      <w:lvlText w:val=""/>
+      <w:lvlJc w:val="left"/>
+      <w:pPr>
+        <w:ind w:left="3960" w:hanging="360"/>
+      </w:pPr>
+      <w:rPr>
+        <w:rFonts w:ascii="Wingdings" w:hAnsi="Wingdings" w:hint="default"/>
+      </w:rPr>
+    </w:lvl>
+    <w:lvl w:ilvl="6" w:tplc="04130001" w:tentative="1">
+      <w:start w:val="1"/>
+      <w:numFmt w:val="bullet"/>
+      <w:lvlText w:val=""/>
+      <w:lvlJc w:val="left"/>
+      <w:pPr>
+        <w:ind w:left="4680" w:hanging="360"/>
+      </w:pPr>
+      <w:rPr>
+        <w:rFonts w:ascii="Symbol" w:hAnsi="Symbol" w:hint="default"/>
+      </w:rPr>
+    </w:lvl>
+    <w:lvl w:ilvl="7" w:tplc="04130003" w:tentative="1">
+      <w:start w:val="1"/>
+      <w:numFmt w:val="bullet"/>
+      <w:lvlText w:val="o"/>
+      <w:lvlJc w:val="left"/>
+      <w:pPr>
+        <w:ind w:left="5400" w:hanging="360"/>
+      </w:pPr>
+      <w:rPr>
+        <w:rFonts w:ascii="Courier New" w:hAnsi="Courier New" w:cs="Courier New" w:hint="default"/>
+      </w:rPr>
+    </w:lvl>
+    <w:lvl w:ilvl="8" w:tplc="04130005" w:tentative="1">
+      <w:start w:val="1"/>
+      <w:numFmt w:val="bullet"/>
+      <w:lvlText w:val=""/>
+      <w:lvlJc w:val="left"/>
+      <w:pPr>
+        <w:ind w:left="6120" w:hanging="360"/>
+      </w:pPr>
+      <w:rPr>
+        <w:rFonts w:ascii="Wingdings" w:hAnsi="Wingdings" w:hint="default"/>
+      </w:rPr>
+    </w:lvl>
+  </w:abstractNum>
+  <w:abstractNum w:abstractNumId="19" w15:restartNumberingAfterBreak="0">
     <w:nsid w:val="4FB460CE"/>
     <w:multiLevelType w:val="multilevel"/>
     <w:tmpl w:val="2326B95A"/>
@@ -7453,7 +8552,7 @@
       </w:rPr>
     </w:lvl>
   </w:abstractNum>
-  <w:abstractNum w:abstractNumId="18" w15:restartNumberingAfterBreak="0">
+  <w:abstractNum w:abstractNumId="20" w15:restartNumberingAfterBreak="0">
     <w:nsid w:val="527814AD"/>
     <w:multiLevelType w:val="multilevel"/>
     <w:tmpl w:val="BDB8C868"/>
@@ -7602,7 +8701,7 @@
       </w:rPr>
     </w:lvl>
   </w:abstractNum>
-  <w:abstractNum w:abstractNumId="19" w15:restartNumberingAfterBreak="0">
+  <w:abstractNum w:abstractNumId="21" w15:restartNumberingAfterBreak="0">
     <w:nsid w:val="54D837D6"/>
     <w:multiLevelType w:val="multilevel"/>
     <w:tmpl w:val="B9B604F2"/>
@@ -7751,7 +8850,7 @@
       </w:rPr>
     </w:lvl>
   </w:abstractNum>
-  <w:abstractNum w:abstractNumId="20" w15:restartNumberingAfterBreak="0">
+  <w:abstractNum w:abstractNumId="22" w15:restartNumberingAfterBreak="0">
     <w:nsid w:val="56572071"/>
     <w:multiLevelType w:val="hybridMultilevel"/>
     <w:tmpl w:val="9B4A147C"/>
@@ -7837,7 +8936,7 @@
       </w:pPr>
     </w:lvl>
   </w:abstractNum>
-  <w:abstractNum w:abstractNumId="21" w15:restartNumberingAfterBreak="0">
+  <w:abstractNum w:abstractNumId="23" w15:restartNumberingAfterBreak="0">
     <w:nsid w:val="5D235165"/>
     <w:multiLevelType w:val="multilevel"/>
     <w:tmpl w:val="871EE970"/>
@@ -7986,7 +9085,7 @@
       </w:rPr>
     </w:lvl>
   </w:abstractNum>
-  <w:abstractNum w:abstractNumId="22" w15:restartNumberingAfterBreak="0">
+  <w:abstractNum w:abstractNumId="24" w15:restartNumberingAfterBreak="0">
     <w:nsid w:val="60F72E05"/>
     <w:multiLevelType w:val="multilevel"/>
     <w:tmpl w:val="566E13D2"/>
@@ -8135,7 +9234,7 @@
       </w:rPr>
     </w:lvl>
   </w:abstractNum>
-  <w:abstractNum w:abstractNumId="23" w15:restartNumberingAfterBreak="0">
+  <w:abstractNum w:abstractNumId="25" w15:restartNumberingAfterBreak="0">
     <w:nsid w:val="612D34AC"/>
     <w:multiLevelType w:val="multilevel"/>
     <w:tmpl w:val="BE4882B2"/>
@@ -8284,7 +9383,7 @@
       </w:rPr>
     </w:lvl>
   </w:abstractNum>
-  <w:abstractNum w:abstractNumId="24" w15:restartNumberingAfterBreak="0">
+  <w:abstractNum w:abstractNumId="26" w15:restartNumberingAfterBreak="0">
     <w:nsid w:val="63F20814"/>
     <w:multiLevelType w:val="hybridMultilevel"/>
     <w:tmpl w:val="72F6C5D0"/>
@@ -8397,7 +9496,7 @@
       </w:rPr>
     </w:lvl>
   </w:abstractNum>
-  <w:abstractNum w:abstractNumId="25" w15:restartNumberingAfterBreak="0">
+  <w:abstractNum w:abstractNumId="27" w15:restartNumberingAfterBreak="0">
     <w:nsid w:val="687F23C2"/>
     <w:multiLevelType w:val="multilevel"/>
     <w:tmpl w:val="0408108E"/>
@@ -8546,7 +9645,7 @@
       </w:rPr>
     </w:lvl>
   </w:abstractNum>
-  <w:abstractNum w:abstractNumId="26" w15:restartNumberingAfterBreak="0">
+  <w:abstractNum w:abstractNumId="28" w15:restartNumberingAfterBreak="0">
     <w:nsid w:val="68B003FA"/>
     <w:multiLevelType w:val="hybridMultilevel"/>
     <w:tmpl w:val="7F0688EE"/>
@@ -8658,7 +9757,7 @@
       </w:rPr>
     </w:lvl>
   </w:abstractNum>
-  <w:abstractNum w:abstractNumId="27" w15:restartNumberingAfterBreak="0">
+  <w:abstractNum w:abstractNumId="29" w15:restartNumberingAfterBreak="0">
     <w:nsid w:val="698732DA"/>
     <w:multiLevelType w:val="multilevel"/>
     <w:tmpl w:val="251AB002"/>
@@ -8807,7 +9906,7 @@
       </w:rPr>
     </w:lvl>
   </w:abstractNum>
-  <w:abstractNum w:abstractNumId="28" w15:restartNumberingAfterBreak="0">
+  <w:abstractNum w:abstractNumId="30" w15:restartNumberingAfterBreak="0">
     <w:nsid w:val="6AB44F7D"/>
     <w:multiLevelType w:val="multilevel"/>
     <w:tmpl w:val="70D62CBE"/>
@@ -8956,7 +10055,120 @@
       </w:rPr>
     </w:lvl>
   </w:abstractNum>
-  <w:abstractNum w:abstractNumId="29" w15:restartNumberingAfterBreak="0">
+  <w:abstractNum w:abstractNumId="31" w15:restartNumberingAfterBreak="0">
+    <w:nsid w:val="6C2508C4"/>
+    <w:multiLevelType w:val="hybridMultilevel"/>
+    <w:tmpl w:val="0BEEEF3C"/>
+    <w:lvl w:ilvl="0" w:tplc="04130001">
+      <w:start w:val="1"/>
+      <w:numFmt w:val="bullet"/>
+      <w:lvlText w:val=""/>
+      <w:lvlJc w:val="left"/>
+      <w:pPr>
+        <w:ind w:left="720" w:hanging="360"/>
+      </w:pPr>
+      <w:rPr>
+        <w:rFonts w:ascii="Symbol" w:hAnsi="Symbol" w:hint="default"/>
+      </w:rPr>
+    </w:lvl>
+    <w:lvl w:ilvl="1" w:tplc="04130003" w:tentative="1">
+      <w:start w:val="1"/>
+      <w:numFmt w:val="bullet"/>
+      <w:lvlText w:val="o"/>
+      <w:lvlJc w:val="left"/>
+      <w:pPr>
+        <w:ind w:left="1440" w:hanging="360"/>
+      </w:pPr>
+      <w:rPr>
+        <w:rFonts w:ascii="Courier New" w:hAnsi="Courier New" w:cs="Courier New" w:hint="default"/>
+      </w:rPr>
+    </w:lvl>
+    <w:lvl w:ilvl="2" w:tplc="04130005" w:tentative="1">
+      <w:start w:val="1"/>
+      <w:numFmt w:val="bullet"/>
+      <w:lvlText w:val=""/>
+      <w:lvlJc w:val="left"/>
+      <w:pPr>
+        <w:ind w:left="2160" w:hanging="360"/>
+      </w:pPr>
+      <w:rPr>
+        <w:rFonts w:ascii="Wingdings" w:hAnsi="Wingdings" w:hint="default"/>
+      </w:rPr>
+    </w:lvl>
+    <w:lvl w:ilvl="3" w:tplc="04130001" w:tentative="1">
+      <w:start w:val="1"/>
+      <w:numFmt w:val="bullet"/>
+      <w:lvlText w:val=""/>
+      <w:lvlJc w:val="left"/>
+      <w:pPr>
+        <w:ind w:left="2880" w:hanging="360"/>
+      </w:pPr>
+      <w:rPr>
+        <w:rFonts w:ascii="Symbol" w:hAnsi="Symbol" w:hint="default"/>
+      </w:rPr>
+    </w:lvl>
+    <w:lvl w:ilvl="4" w:tplc="04130003" w:tentative="1">
+      <w:start w:val="1"/>
+      <w:numFmt w:val="bullet"/>
+      <w:lvlText w:val="o"/>
+      <w:lvlJc w:val="left"/>
+      <w:pPr>
+        <w:ind w:left="3600" w:hanging="360"/>
+      </w:pPr>
+      <w:rPr>
+        <w:rFonts w:ascii="Courier New" w:hAnsi="Courier New" w:cs="Courier New" w:hint="default"/>
+      </w:rPr>
+    </w:lvl>
+    <w:lvl w:ilvl="5" w:tplc="04130005" w:tentative="1">
+      <w:start w:val="1"/>
+      <w:numFmt w:val="bullet"/>
+      <w:lvlText w:val=""/>
+      <w:lvlJc w:val="left"/>
+      <w:pPr>
+        <w:ind w:left="4320" w:hanging="360"/>
+      </w:pPr>
+      <w:rPr>
+        <w:rFonts w:ascii="Wingdings" w:hAnsi="Wingdings" w:hint="default"/>
+      </w:rPr>
+    </w:lvl>
+    <w:lvl w:ilvl="6" w:tplc="04130001" w:tentative="1">
+      <w:start w:val="1"/>
+      <w:numFmt w:val="bullet"/>
+      <w:lvlText w:val=""/>
+      <w:lvlJc w:val="left"/>
+      <w:pPr>
+        <w:ind w:left="5040" w:hanging="360"/>
+      </w:pPr>
+      <w:rPr>
+        <w:rFonts w:ascii="Symbol" w:hAnsi="Symbol" w:hint="default"/>
+      </w:rPr>
+    </w:lvl>
+    <w:lvl w:ilvl="7" w:tplc="04130003" w:tentative="1">
+      <w:start w:val="1"/>
+      <w:numFmt w:val="bullet"/>
+      <w:lvlText w:val="o"/>
+      <w:lvlJc w:val="left"/>
+      <w:pPr>
+        <w:ind w:left="5760" w:hanging="360"/>
+      </w:pPr>
+      <w:rPr>
+        <w:rFonts w:ascii="Courier New" w:hAnsi="Courier New" w:cs="Courier New" w:hint="default"/>
+      </w:rPr>
+    </w:lvl>
+    <w:lvl w:ilvl="8" w:tplc="04130005" w:tentative="1">
+      <w:start w:val="1"/>
+      <w:numFmt w:val="bullet"/>
+      <w:lvlText w:val=""/>
+      <w:lvlJc w:val="left"/>
+      <w:pPr>
+        <w:ind w:left="6480" w:hanging="360"/>
+      </w:pPr>
+      <w:rPr>
+        <w:rFonts w:ascii="Wingdings" w:hAnsi="Wingdings" w:hint="default"/>
+      </w:rPr>
+    </w:lvl>
+  </w:abstractNum>
+  <w:abstractNum w:abstractNumId="32" w15:restartNumberingAfterBreak="0">
     <w:nsid w:val="756506D6"/>
     <w:multiLevelType w:val="hybridMultilevel"/>
     <w:tmpl w:val="BD563AAC"/>
@@ -9044,7 +10256,7 @@
       </w:pPr>
     </w:lvl>
   </w:abstractNum>
-  <w:abstractNum w:abstractNumId="30" w15:restartNumberingAfterBreak="0">
+  <w:abstractNum w:abstractNumId="33" w15:restartNumberingAfterBreak="0">
     <w:nsid w:val="76741E96"/>
     <w:multiLevelType w:val="multilevel"/>
     <w:tmpl w:val="28B61944"/>
@@ -9193,7 +10405,7 @@
       </w:rPr>
     </w:lvl>
   </w:abstractNum>
-  <w:abstractNum w:abstractNumId="31" w15:restartNumberingAfterBreak="0">
+  <w:abstractNum w:abstractNumId="34" w15:restartNumberingAfterBreak="0">
     <w:nsid w:val="7686484E"/>
     <w:multiLevelType w:val="hybridMultilevel"/>
     <w:tmpl w:val="21982988"/>
@@ -9305,7 +10517,7 @@
       </w:rPr>
     </w:lvl>
   </w:abstractNum>
-  <w:abstractNum w:abstractNumId="32" w15:restartNumberingAfterBreak="0">
+  <w:abstractNum w:abstractNumId="35" w15:restartNumberingAfterBreak="0">
     <w:nsid w:val="7ABA789E"/>
     <w:multiLevelType w:val="multilevel"/>
     <w:tmpl w:val="0D34D79A"/>
@@ -9454,7 +10666,7 @@
       </w:rPr>
     </w:lvl>
   </w:abstractNum>
-  <w:abstractNum w:abstractNumId="33" w15:restartNumberingAfterBreak="0">
+  <w:abstractNum w:abstractNumId="36" w15:restartNumberingAfterBreak="0">
     <w:nsid w:val="7C756ADE"/>
     <w:multiLevelType w:val="multilevel"/>
     <w:tmpl w:val="260047C6"/>
@@ -9603,7 +10815,7 @@
       </w:rPr>
     </w:lvl>
   </w:abstractNum>
-  <w:abstractNum w:abstractNumId="34" w15:restartNumberingAfterBreak="0">
+  <w:abstractNum w:abstractNumId="37" w15:restartNumberingAfterBreak="0">
     <w:nsid w:val="7DB4285F"/>
     <w:multiLevelType w:val="multilevel"/>
     <w:tmpl w:val="1BF4CC4A"/>
@@ -9752,7 +10964,120 @@
       </w:rPr>
     </w:lvl>
   </w:abstractNum>
-  <w:abstractNum w:abstractNumId="35" w15:restartNumberingAfterBreak="0">
+  <w:abstractNum w:abstractNumId="38" w15:restartNumberingAfterBreak="0">
+    <w:nsid w:val="7E351015"/>
+    <w:multiLevelType w:val="hybridMultilevel"/>
+    <w:tmpl w:val="58C86054"/>
+    <w:lvl w:ilvl="0" w:tplc="04130001">
+      <w:start w:val="1"/>
+      <w:numFmt w:val="bullet"/>
+      <w:lvlText w:val=""/>
+      <w:lvlJc w:val="left"/>
+      <w:pPr>
+        <w:ind w:left="360" w:hanging="360"/>
+      </w:pPr>
+      <w:rPr>
+        <w:rFonts w:ascii="Symbol" w:hAnsi="Symbol" w:hint="default"/>
+      </w:rPr>
+    </w:lvl>
+    <w:lvl w:ilvl="1" w:tplc="04130003" w:tentative="1">
+      <w:start w:val="1"/>
+      <w:numFmt w:val="bullet"/>
+      <w:lvlText w:val="o"/>
+      <w:lvlJc w:val="left"/>
+      <w:pPr>
+        <w:ind w:left="1080" w:hanging="360"/>
+      </w:pPr>
+      <w:rPr>
+        <w:rFonts w:ascii="Courier New" w:hAnsi="Courier New" w:cs="Courier New" w:hint="default"/>
+      </w:rPr>
+    </w:lvl>
+    <w:lvl w:ilvl="2" w:tplc="04130005" w:tentative="1">
+      <w:start w:val="1"/>
+      <w:numFmt w:val="bullet"/>
+      <w:lvlText w:val=""/>
+      <w:lvlJc w:val="left"/>
+      <w:pPr>
+        <w:ind w:left="1800" w:hanging="360"/>
+      </w:pPr>
+      <w:rPr>
+        <w:rFonts w:ascii="Wingdings" w:hAnsi="Wingdings" w:hint="default"/>
+      </w:rPr>
+    </w:lvl>
+    <w:lvl w:ilvl="3" w:tplc="04130001" w:tentative="1">
+      <w:start w:val="1"/>
+      <w:numFmt w:val="bullet"/>
+      <w:lvlText w:val=""/>
+      <w:lvlJc w:val="left"/>
+      <w:pPr>
+        <w:ind w:left="2520" w:hanging="360"/>
+      </w:pPr>
+      <w:rPr>
+        <w:rFonts w:ascii="Symbol" w:hAnsi="Symbol" w:hint="default"/>
+      </w:rPr>
+    </w:lvl>
+    <w:lvl w:ilvl="4" w:tplc="04130003" w:tentative="1">
+      <w:start w:val="1"/>
+      <w:numFmt w:val="bullet"/>
+      <w:lvlText w:val="o"/>
+      <w:lvlJc w:val="left"/>
+      <w:pPr>
+        <w:ind w:left="3240" w:hanging="360"/>
+      </w:pPr>
+      <w:rPr>
+        <w:rFonts w:ascii="Courier New" w:hAnsi="Courier New" w:cs="Courier New" w:hint="default"/>
+      </w:rPr>
+    </w:lvl>
+    <w:lvl w:ilvl="5" w:tplc="04130005" w:tentative="1">
+      <w:start w:val="1"/>
+      <w:numFmt w:val="bullet"/>
+      <w:lvlText w:val=""/>
+      <w:lvlJc w:val="left"/>
+      <w:pPr>
+        <w:ind w:left="3960" w:hanging="360"/>
+      </w:pPr>
+      <w:rPr>
+        <w:rFonts w:ascii="Wingdings" w:hAnsi="Wingdings" w:hint="default"/>
+      </w:rPr>
+    </w:lvl>
+    <w:lvl w:ilvl="6" w:tplc="04130001" w:tentative="1">
+      <w:start w:val="1"/>
+      <w:numFmt w:val="bullet"/>
+      <w:lvlText w:val=""/>
+      <w:lvlJc w:val="left"/>
+      <w:pPr>
+        <w:ind w:left="4680" w:hanging="360"/>
+      </w:pPr>
+      <w:rPr>
+        <w:rFonts w:ascii="Symbol" w:hAnsi="Symbol" w:hint="default"/>
+      </w:rPr>
+    </w:lvl>
+    <w:lvl w:ilvl="7" w:tplc="04130003" w:tentative="1">
+      <w:start w:val="1"/>
+      <w:numFmt w:val="bullet"/>
+      <w:lvlText w:val="o"/>
+      <w:lvlJc w:val="left"/>
+      <w:pPr>
+        <w:ind w:left="5400" w:hanging="360"/>
+      </w:pPr>
+      <w:rPr>
+        <w:rFonts w:ascii="Courier New" w:hAnsi="Courier New" w:cs="Courier New" w:hint="default"/>
+      </w:rPr>
+    </w:lvl>
+    <w:lvl w:ilvl="8" w:tplc="04130005" w:tentative="1">
+      <w:start w:val="1"/>
+      <w:numFmt w:val="bullet"/>
+      <w:lvlText w:val=""/>
+      <w:lvlJc w:val="left"/>
+      <w:pPr>
+        <w:ind w:left="6120" w:hanging="360"/>
+      </w:pPr>
+      <w:rPr>
+        <w:rFonts w:ascii="Wingdings" w:hAnsi="Wingdings" w:hint="default"/>
+      </w:rPr>
+    </w:lvl>
+  </w:abstractNum>
+  <w:abstractNum w:abstractNumId="39" w15:restartNumberingAfterBreak="0">
     <w:nsid w:val="7FA65608"/>
     <w:multiLevelType w:val="multilevel"/>
     <w:tmpl w:val="582860F4"/>
@@ -9902,112 +11227,124 @@
     </w:lvl>
   </w:abstractNum>
   <w:num w:numId="1" w16cid:durableId="2020812334">
-    <w:abstractNumId w:val="15"/>
+    <w:abstractNumId w:val="16"/>
   </w:num>
   <w:num w:numId="2" w16cid:durableId="709037371">
-    <w:abstractNumId w:val="8"/>
+    <w:abstractNumId w:val="9"/>
   </w:num>
   <w:num w:numId="3" w16cid:durableId="67849992">
-    <w:abstractNumId w:val="21"/>
+    <w:abstractNumId w:val="23"/>
   </w:num>
   <w:num w:numId="4" w16cid:durableId="2142653765">
     <w:abstractNumId w:val="0"/>
   </w:num>
   <w:num w:numId="5" w16cid:durableId="1113936578">
+    <w:abstractNumId w:val="33"/>
+  </w:num>
+  <w:num w:numId="6" w16cid:durableId="1606233580">
+    <w:abstractNumId w:val="29"/>
+  </w:num>
+  <w:num w:numId="7" w16cid:durableId="748574053">
+    <w:abstractNumId w:val="19"/>
+  </w:num>
+  <w:num w:numId="8" w16cid:durableId="1706056135">
+    <w:abstractNumId w:val="17"/>
+  </w:num>
+  <w:num w:numId="9" w16cid:durableId="1430466659">
+    <w:abstractNumId w:val="6"/>
+  </w:num>
+  <w:num w:numId="10" w16cid:durableId="1230310489">
+    <w:abstractNumId w:val="12"/>
+  </w:num>
+  <w:num w:numId="11" w16cid:durableId="420681672">
+    <w:abstractNumId w:val="11"/>
+  </w:num>
+  <w:num w:numId="12" w16cid:durableId="1614441755">
+    <w:abstractNumId w:val="7"/>
+  </w:num>
+  <w:num w:numId="13" w16cid:durableId="1968779733">
+    <w:abstractNumId w:val="36"/>
+  </w:num>
+  <w:num w:numId="14" w16cid:durableId="1594587819">
+    <w:abstractNumId w:val="37"/>
+  </w:num>
+  <w:num w:numId="15" w16cid:durableId="956179623">
+    <w:abstractNumId w:val="15"/>
+  </w:num>
+  <w:num w:numId="16" w16cid:durableId="289289896">
+    <w:abstractNumId w:val="21"/>
+  </w:num>
+  <w:num w:numId="17" w16cid:durableId="2068143515">
     <w:abstractNumId w:val="30"/>
   </w:num>
-  <w:num w:numId="6" w16cid:durableId="1606233580">
-    <w:abstractNumId w:val="27"/>
-  </w:num>
-  <w:num w:numId="7" w16cid:durableId="748574053">
-    <w:abstractNumId w:val="17"/>
-  </w:num>
-  <w:num w:numId="8" w16cid:durableId="1706056135">
-    <w:abstractNumId w:val="16"/>
-  </w:num>
-  <w:num w:numId="9" w16cid:durableId="1430466659">
-    <w:abstractNumId w:val="5"/>
-  </w:num>
-  <w:num w:numId="10" w16cid:durableId="1230310489">
-    <w:abstractNumId w:val="11"/>
-  </w:num>
-  <w:num w:numId="11" w16cid:durableId="420681672">
-    <w:abstractNumId w:val="10"/>
-  </w:num>
-  <w:num w:numId="12" w16cid:durableId="1614441755">
-    <w:abstractNumId w:val="6"/>
-  </w:num>
-  <w:num w:numId="13" w16cid:durableId="1968779733">
-    <w:abstractNumId w:val="33"/>
-  </w:num>
-  <w:num w:numId="14" w16cid:durableId="1594587819">
-    <w:abstractNumId w:val="34"/>
-  </w:num>
-  <w:num w:numId="15" w16cid:durableId="956179623">
-    <w:abstractNumId w:val="14"/>
-  </w:num>
-  <w:num w:numId="16" w16cid:durableId="289289896">
-    <w:abstractNumId w:val="19"/>
-  </w:num>
-  <w:num w:numId="17" w16cid:durableId="2068143515">
-    <w:abstractNumId w:val="28"/>
-  </w:num>
   <w:num w:numId="18" w16cid:durableId="1896575303">
-    <w:abstractNumId w:val="18"/>
+    <w:abstractNumId w:val="20"/>
   </w:num>
   <w:num w:numId="19" w16cid:durableId="926041470">
     <w:abstractNumId w:val="2"/>
   </w:num>
   <w:num w:numId="20" w16cid:durableId="1542324880">
-    <w:abstractNumId w:val="13"/>
+    <w:abstractNumId w:val="14"/>
   </w:num>
   <w:num w:numId="21" w16cid:durableId="409816552">
     <w:abstractNumId w:val="3"/>
   </w:num>
   <w:num w:numId="22" w16cid:durableId="1909919691">
-    <w:abstractNumId w:val="32"/>
+    <w:abstractNumId w:val="35"/>
   </w:num>
   <w:num w:numId="23" w16cid:durableId="1684547546">
     <w:abstractNumId w:val="4"/>
   </w:num>
   <w:num w:numId="24" w16cid:durableId="171264522">
-    <w:abstractNumId w:val="7"/>
+    <w:abstractNumId w:val="8"/>
   </w:num>
   <w:num w:numId="25" w16cid:durableId="1861431314">
-    <w:abstractNumId w:val="20"/>
+    <w:abstractNumId w:val="22"/>
   </w:num>
   <w:num w:numId="26" w16cid:durableId="2077127189">
-    <w:abstractNumId w:val="29"/>
+    <w:abstractNumId w:val="32"/>
   </w:num>
   <w:num w:numId="27" w16cid:durableId="598949354">
     <w:abstractNumId w:val="1"/>
   </w:num>
   <w:num w:numId="28" w16cid:durableId="455410580">
-    <w:abstractNumId w:val="31"/>
+    <w:abstractNumId w:val="34"/>
   </w:num>
   <w:num w:numId="29" w16cid:durableId="363791994">
-    <w:abstractNumId w:val="9"/>
+    <w:abstractNumId w:val="10"/>
   </w:num>
   <w:num w:numId="30" w16cid:durableId="641692985">
+    <w:abstractNumId w:val="28"/>
+  </w:num>
+  <w:num w:numId="31" w16cid:durableId="1769617515">
+    <w:abstractNumId w:val="39"/>
+  </w:num>
+  <w:num w:numId="32" w16cid:durableId="40594755">
+    <w:abstractNumId w:val="13"/>
+  </w:num>
+  <w:num w:numId="33" w16cid:durableId="668756876">
+    <w:abstractNumId w:val="25"/>
+  </w:num>
+  <w:num w:numId="34" w16cid:durableId="1314331147">
+    <w:abstractNumId w:val="24"/>
+  </w:num>
+  <w:num w:numId="35" w16cid:durableId="1159809409">
+    <w:abstractNumId w:val="27"/>
+  </w:num>
+  <w:num w:numId="36" w16cid:durableId="185945283">
     <w:abstractNumId w:val="26"/>
   </w:num>
-  <w:num w:numId="31" w16cid:durableId="1769617515">
-    <w:abstractNumId w:val="35"/>
+  <w:num w:numId="37" w16cid:durableId="1936742370">
+    <w:abstractNumId w:val="18"/>
   </w:num>
-  <w:num w:numId="32" w16cid:durableId="40594755">
-    <w:abstractNumId w:val="12"/>
+  <w:num w:numId="38" w16cid:durableId="426314421">
+    <w:abstractNumId w:val="38"/>
   </w:num>
-  <w:num w:numId="33" w16cid:durableId="668756876">
-    <w:abstractNumId w:val="23"/>
+  <w:num w:numId="39" w16cid:durableId="1674068109">
+    <w:abstractNumId w:val="5"/>
   </w:num>
-  <w:num w:numId="34" w16cid:durableId="1314331147">
-    <w:abstractNumId w:val="22"/>
-  </w:num>
-  <w:num w:numId="35" w16cid:durableId="1159809409">
-    <w:abstractNumId w:val="25"/>
-  </w:num>
-  <w:num w:numId="36" w16cid:durableId="185945283">
-    <w:abstractNumId w:val="24"/>
+  <w:num w:numId="40" w16cid:durableId="341511975">
+    <w:abstractNumId w:val="31"/>
   </w:num>
 </w:numbering>
 </file>
@@ -11097,6 +12434,38 @@
     <w:unhideWhenUsed/>
     <w:rsid w:val="00682305"/>
   </w:style>
+  <w:style w:type="paragraph" w:styleId="Bijschrift">
+    <w:name w:val="caption"/>
+    <w:basedOn w:val="Standaard"/>
+    <w:next w:val="Standaard"/>
+    <w:uiPriority w:val="35"/>
+    <w:unhideWhenUsed/>
+    <w:qFormat/>
+    <w:rsid w:val="009758D2"/>
+    <w:pPr>
+      <w:spacing w:after="200" w:line="240" w:lineRule="auto"/>
+    </w:pPr>
+    <w:rPr>
+      <w:i/>
+      <w:iCs/>
+      <w:color w:val="44546A" w:themeColor="text2"/>
+      <w:sz w:val="18"/>
+      <w:szCs w:val="18"/>
+    </w:rPr>
+  </w:style>
+  <w:style w:type="paragraph" w:styleId="Normaalweb">
+    <w:name w:val="Normal (Web)"/>
+    <w:basedOn w:val="Standaard"/>
+    <w:uiPriority w:val="99"/>
+    <w:semiHidden/>
+    <w:unhideWhenUsed/>
+    <w:rsid w:val="00713C64"/>
+    <w:rPr>
+      <w:rFonts w:ascii="Times New Roman" w:hAnsi="Times New Roman" w:cs="Times New Roman"/>
+      <w:sz w:val="24"/>
+      <w:szCs w:val="24"/>
+    </w:rPr>
+  </w:style>
 </w:styles>
 </file>
 
@@ -11453,7 +12822,7 @@
     <b:Title>Github repository</b:Title>
     <b:Year>2026</b:Year>
     <b:URL>https://github.com/Excali8ur/Meeplewood</b:URL>
-    <b:RefOrder>9</b:RefOrder>
+    <b:RefOrder>10</b:RefOrder>
   </b:Source>
   <b:Source>
     <b:Tag>Cro23</b:Tag>
@@ -11553,7 +12922,7 @@
     <b:Guid>{553E1E9D-2A0A-4F3B-A618-E1E46BF68AA6}</b:Guid>
     <b:Title>NemeStats</b:Title>
     <b:URL>https://nemestats.com/</b:URL>
-    <b:RefOrder>10</b:RefOrder>
+    <b:RefOrder>11</b:RefOrder>
   </b:Source>
   <b:Source>
     <b:Tag>Lin</b:Tag>
@@ -11563,7 +12932,7 @@
     <b:URL>https://www.linkedin.com/in/rianneverheijen/</b:URL>
     <b:LCID>en-GB</b:LCID>
     <b:InternetSiteTitle>LinkedIn</b:InternetSiteTitle>
-    <b:RefOrder>11</b:RefOrder>
+    <b:RefOrder>12</b:RefOrder>
   </b:Source>
   <b:Source>
     <b:Tag>Cha</b:Tag>
@@ -11582,6 +12951,14 @@
     <b:URL>https://boardgamegeek.com/</b:URL>
     <b:RefOrder>2</b:RefOrder>
   </b:Source>
+  <b:Source>
+    <b:Tag>BGG</b:Tag>
+    <b:SourceType>InternetSite</b:SourceType>
+    <b:Guid>{AE0E92E7-B2E9-4E2B-92DF-0381A1126020}</b:Guid>
+    <b:Title>BGG Wiki</b:Title>
+    <b:URL>https://boardgamegeek.com/wiki/page/Guide_To_BoardGameGeek</b:URL>
+    <b:RefOrder>9</b:RefOrder>
+  </b:Source>
 </b:Sources>
 </file>
 
@@ -11594,7 +12971,7 @@
 </file>
 
 <file path=customXml/itemProps2.xml><?xml version="1.0" encoding="utf-8"?>
-<ds:datastoreItem xmlns:ds="http://schemas.openxmlformats.org/officeDocument/2006/customXml" ds:itemID="{DACA4050-8956-409B-A484-A5326E26E9B8}">
+<ds:datastoreItem xmlns:ds="http://schemas.openxmlformats.org/officeDocument/2006/customXml" ds:itemID="{628791DC-0EE7-420C-BE10-C51E76B3A3B3}">
   <ds:schemaRefs>
     <ds:schemaRef ds:uri="http://schemas.openxmlformats.org/officeDocument/2006/bibliography"/>
   </ds:schemaRefs>

</xml_diff>